<commit_message>
:books: docs: Documentação da Task #123 atualizada
</commit_message>
<xml_diff>
--- a/Documents/Documents/Sprint10_Task123_Padrinizacao_da_api.docx
+++ b/Documents/Documents/Sprint10_Task123_Padrinizacao_da_api.docx
@@ -35,7 +35,7 @@
                         </pic:cNvPicPr>
                         <pic:nvPr/>
                       </pic:nvPicPr>
-                      <pic:blipFill>
+                      <pic:blipFill rotWithShape="1">
                         <a:blip r:embed="rId12"/>
                         <a:stretch/>
                       </pic:blipFill>
@@ -91,7 +91,7 @@
     </w:p>
     <w:tbl>
       <w:tblPr>
-        <w:tblStyle w:val="759"/>
+        <w:tblStyle w:val="927"/>
         <w:tblW w:w="10201" w:type="dxa"/>
         <w:tblBorders/>
         <w:tblLook w:val="04A0" w:firstRow="1" w:lastRow="0" w:firstColumn="1" w:lastColumn="0" w:noHBand="0" w:noVBand="1"/>
@@ -143,6 +143,14 @@
                 <w:szCs w:val="28"/>
               </w:rPr>
             </w:r>
+            <w:r>
+              <w:rPr>
+                <w:b/>
+                <w:bCs/>
+                <w:sz w:val="28"/>
+                <w:szCs w:val="28"/>
+              </w:rPr>
+            </w:r>
           </w:p>
         </w:tc>
       </w:tr>
@@ -173,6 +181,13 @@
                 <w:bCs/>
               </w:rPr>
               <w:t xml:space="preserve">Sprint #10</w:t>
+            </w:r>
+            <w:r>
+              <w:rPr>
+                <w:rFonts w:ascii="Aptos" w:hAnsi="Aptos" w:eastAsia="Aptos" w:cs="Aptos"/>
+                <w:b/>
+                <w:bCs/>
+              </w:rPr>
             </w:r>
             <w:r>
               <w:rPr>
@@ -213,6 +228,12 @@
                 <w:bCs/>
               </w:rPr>
               <w:t xml:space="preserve"> 22/09/2025</w:t>
+            </w:r>
+            <w:r>
+              <w:rPr>
+                <w:b/>
+                <w:bCs/>
+              </w:rPr>
             </w:r>
             <w:r>
               <w:rPr>
@@ -328,6 +349,12 @@
                 <w:bCs/>
               </w:rPr>
             </w:r>
+            <w:r>
+              <w:rPr>
+                <w:b/>
+                <w:bCs/>
+              </w:rPr>
+            </w:r>
           </w:p>
         </w:tc>
         <w:tc>
@@ -361,24 +388,6 @@
                 <w:bCs/>
               </w:rPr>
               <w:t xml:space="preserve">-Backend</w:t>
-            </w:r>
-            <w:r>
-              <w:rPr>
-                <w:b/>
-                <w:bCs/>
-              </w:rPr>
-            </w:r>
-            <w:r>
-              <w:rPr>
-                <w:b/>
-                <w:bCs/>
-              </w:rPr>
-            </w:r>
-            <w:r>
-              <w:rPr>
-                <w:b/>
-                <w:bCs/>
-              </w:rPr>
             </w:r>
             <w:r>
               <w:rPr>
@@ -434,6 +443,12 @@
                 <w:bCs/>
               </w:rPr>
             </w:r>
+            <w:r>
+              <w:rPr>
+                <w:b/>
+                <w:bCs/>
+              </w:rPr>
+            </w:r>
           </w:p>
         </w:tc>
         <w:tc>
@@ -460,6 +475,12 @@
                 <w:bCs/>
               </w:rPr>
               <w:t xml:space="preserve">Análise e Desenvolvimento de Sistemas - AMS</w:t>
+            </w:r>
+            <w:r>
+              <w:rPr>
+                <w:b/>
+                <w:bCs/>
+              </w:rPr>
             </w:r>
             <w:r>
               <w:rPr>
@@ -499,6 +520,12 @@
                 <w:color w:val="ffffff" w:themeColor="background1"/>
               </w:rPr>
               <w:t xml:space="preserve">Team Members</w:t>
+            </w:r>
+            <w:r>
+              <w:rPr>
+                <w:b/>
+                <w:bCs/>
+              </w:rPr>
             </w:r>
             <w:r>
               <w:rPr>
@@ -555,11 +582,6 @@
             <w:r>
               <w:t xml:space="preserve">Lemuel Prates Sobrinho Ferreira</w:t>
             </w:r>
-            <w:r/>
-            <w:r/>
-            <w:r/>
-            <w:r/>
-            <w:r/>
             <w:r/>
           </w:p>
         </w:tc>
@@ -643,7 +665,7 @@
     </w:p>
     <w:tbl>
       <w:tblPr>
-        <w:tblStyle w:val="759"/>
+        <w:tblStyle w:val="927"/>
         <w:tblW w:w="10201" w:type="dxa"/>
         <w:tblBorders/>
         <w:tblLook w:val="04A0" w:firstRow="1" w:lastRow="0" w:firstColumn="1" w:lastColumn="0" w:noHBand="0" w:noVBand="1"/>
@@ -682,6 +704,12 @@
                 <w:bCs/>
               </w:rPr>
               <w:t xml:space="preserve">Sprint Backlog</w:t>
+            </w:r>
+            <w:r>
+              <w:rPr>
+                <w:b/>
+                <w:bCs/>
+              </w:rPr>
             </w:r>
             <w:r>
               <w:rPr>
@@ -811,11 +839,9 @@
               <w:ind/>
               <w:rPr/>
             </w:pPr>
-            <w:r/>
             <w:r>
               <w:t xml:space="preserve">Sprint 10 - Padronização da API</w:t>
             </w:r>
-            <w:r/>
             <w:r/>
           </w:p>
         </w:tc>
@@ -842,6 +868,12 @@
                 <w:bCs w:val="0"/>
               </w:rPr>
               <w:t xml:space="preserve">22/09/2025</w:t>
+            </w:r>
+            <w:r>
+              <w:rPr>
+                <w:b w:val="0"/>
+                <w:bCs w:val="0"/>
+              </w:rPr>
             </w:r>
             <w:r>
               <w:rPr>
@@ -1110,7 +1142,7 @@
     </w:p>
     <w:tbl>
       <w:tblPr>
-        <w:tblStyle w:val="759"/>
+        <w:tblStyle w:val="927"/>
         <w:tblW w:w="0" w:type="auto"/>
         <w:tblBorders/>
         <w:tblLook w:val="04A0" w:firstRow="1" w:lastRow="0" w:firstColumn="1" w:lastColumn="0" w:noHBand="0" w:noVBand="1"/>
@@ -1151,6 +1183,12 @@
                 <w:bCs/>
               </w:rPr>
               <w:t xml:space="preserve">Task Description</w:t>
+            </w:r>
+            <w:r>
+              <w:rPr>
+                <w:b/>
+                <w:bCs/>
+              </w:rPr>
             </w:r>
             <w:r>
               <w:rPr>
@@ -1320,11 +1358,9 @@
               <w:ind/>
               <w:rPr/>
             </w:pPr>
-            <w:r/>
             <w:r>
               <w:t xml:space="preserve">Sprint 10 - Padronização da API</w:t>
             </w:r>
-            <w:r/>
             <w:r/>
           </w:p>
         </w:tc>
@@ -1539,7 +1575,7 @@
     </w:p>
     <w:tbl>
       <w:tblPr>
-        <w:tblStyle w:val="759"/>
+        <w:tblStyle w:val="927"/>
         <w:tblW w:w="0" w:type="auto"/>
         <w:tblBorders/>
         <w:tblLook w:val="04A0" w:firstRow="1" w:lastRow="0" w:firstColumn="1" w:lastColumn="0" w:noHBand="0" w:noVBand="1"/>
@@ -1588,6 +1624,14 @@
                 <w:szCs w:val="24"/>
               </w:rPr>
             </w:r>
+            <w:r>
+              <w:rPr>
+                <w:b/>
+                <w:bCs/>
+                <w:sz w:val="24"/>
+                <w:szCs w:val="24"/>
+              </w:rPr>
+            </w:r>
           </w:p>
         </w:tc>
       </w:tr>
@@ -1625,6 +1669,12 @@
           <w:bCs/>
         </w:rPr>
       </w:r>
+      <w:r>
+        <w:rPr>
+          <w:b/>
+          <w:bCs/>
+        </w:rPr>
+      </w:r>
     </w:p>
     <w:p>
       <w:pPr>
@@ -1634,7 +1684,10 @@
         <w:rPr/>
       </w:pPr>
       <w:r>
-        <w:t xml:space="preserve">Sua API é um backend construído em ASP.NET Core (C#), focada no gerenciamento de entidades relacionadas a produtos e fabricantes, provavelmente para um sistema de saúde ou geriatria (SeniorCareManager). Ela segue a arquitetura RESTful e utiliza o padrão DTO</w:t>
+        <w:t xml:space="preserve">S</w:t>
+      </w:r>
+      <w:r>
+        <w:t xml:space="preserve">ua API é um backend construído em ASP.NET Core (C#), focada no gerenciamento de entidades relacionadas a produtos e fabricantes, provavelmente para um sistema de saúde ou geriatria (SeniorCareManager). Ela segue a arquitetura RESTful e utiliza o padrão DTO</w:t>
       </w:r>
       <w:r>
         <w:t xml:space="preserve"> (Data Transfer Object) para separar a camada de modelo de dados (Manufacturer.cs, ProductType.cs) da camada de comunicação (ManufacturerDTO.cs, ProductTypeDTO.cs).</w:t>
@@ -1784,6 +1837,12 @@
           <w:bCs/>
         </w:rPr>
       </w:r>
+      <w:r>
+        <w:rPr>
+          <w:b/>
+          <w:bCs/>
+        </w:rPr>
+      </w:r>
     </w:p>
     <w:p>
       <w:pPr>
@@ -1927,7 +1986,10 @@
         <w:rPr/>
       </w:pPr>
       <w:r>
-        <w:t xml:space="preserve">Referência: Alterações na camada Service (ex: ManufacturerService.cs) e validações para garantir que erros de negócio (duplicidade) e validação de dados retornem os status HTTP corretos (como 409 Conflict ou 400 Bad Request), e não apenas 200 OK ou 500 Inte</w:t>
+        <w:t xml:space="preserve">R</w:t>
+      </w:r>
+      <w:r>
+        <w:t xml:space="preserve">eferência: Alterações na camada Service (ex: ManufacturerService.cs) e validações para garantir que erros de negócio (duplicidade) e validação de dados retornem os status HTTP corretos (como 409 Conflict ou 400 Bad Request), e não apenas 200 OK ou 500 Inte</w:t>
       </w:r>
       <w:r>
         <w:t xml:space="preserve">rnal Server Error genéricos.</w:t>
@@ -2015,13 +2077,66 @@
         <w:pBdr/>
         <w:spacing/>
         <w:ind/>
-        <w:rPr/>
+        <w:rPr>
+          <w:highlight w:val="none"/>
+        </w:rPr>
       </w:pPr>
       <w:r>
         <w:t xml:space="preserve">A proteção via JWT (ponto 1) é aplicada nas Controllers usando anotações como [Authorize].</w:t>
       </w:r>
+      <w:r>
+        <w:rPr>
+          <w:highlight w:val="none"/>
+        </w:rPr>
+      </w:r>
+    </w:p>
+    <w:p>
+      <w:pPr>
+        <w:pBdr/>
+        <w:spacing/>
+        <w:ind/>
+        <w:rPr/>
+      </w:pPr>
       <w:r/>
       <w:r/>
+    </w:p>
+    <w:p>
+      <w:pPr>
+        <w:pBdr/>
+        <w:spacing/>
+        <w:ind/>
+        <w:rPr/>
+      </w:pPr>
+      <w:r/>
+      <w:r/>
+    </w:p>
+    <w:p>
+      <w:pPr>
+        <w:pBdr/>
+        <w:spacing/>
+        <w:ind/>
+        <w:rPr/>
+      </w:pPr>
+      <w:r/>
+      <w:r/>
+    </w:p>
+    <w:p>
+      <w:pPr>
+        <w:pBdr/>
+        <w:spacing/>
+        <w:ind/>
+        <w:rPr/>
+      </w:pPr>
+      <w:r>
+        <w:rPr>
+          <w:highlight w:val="none"/>
+        </w:rPr>
+      </w:r>
+      <w:r>
+        <w:rPr>
+          <w:highlight w:val="none"/>
+        </w:rPr>
+      </w:r>
       <w:r/>
     </w:p>
     <w:p>
@@ -2043,6 +2158,59 @@
         </w:rPr>
         <w:t xml:space="preserve">Assinaturas</w:t>
       </w:r>
+      <w:r/>
+    </w:p>
+    <w:p>
+      <w:pPr>
+        <w:pBdr/>
+        <w:spacing/>
+        <w:ind/>
+        <w:rPr/>
+      </w:pPr>
+      <w:r>
+        <w:rPr>
+          <w:highlight w:val="none"/>
+        </w:rPr>
+      </w:r>
+      <w:r>
+        <w:rPr>
+          <w:highlight w:val="none"/>
+        </w:rPr>
+      </w:r>
+      <w:r/>
+    </w:p>
+    <w:p>
+      <w:pPr>
+        <w:pBdr/>
+        <w:spacing/>
+        <w:ind/>
+        <w:rPr>
+          <w:highlight w:val="none"/>
+        </w:rPr>
+      </w:pPr>
+      <w:r>
+        <w:t xml:space="preserve">Lemuel Prates Sobrinho Ferreira</w:t>
+      </w:r>
+      <w:r>
+        <w:t xml:space="preserve">                          </w:t>
+      </w:r>
+      <w:r>
+        <w:t xml:space="preserve">Gabriel Neto Siqueira</w:t>
+      </w:r>
+      <w:r>
+        <w:rPr>
+          <w:highlight w:val="none"/>
+        </w:rPr>
+      </w:r>
+    </w:p>
+    <w:p>
+      <w:pPr>
+        <w:pBdr/>
+        <w:spacing/>
+        <w:ind/>
+        <w:rPr/>
+      </w:pPr>
+      <w:r/>
       <w:r/>
     </w:p>
     <w:p>
@@ -2115,6 +2283,13 @@
           <w:szCs w:val="24"/>
         </w:rPr>
         <w:t xml:space="preserve">Orientador: Jefferson Antonio Ribeiro Passerini</w:t>
+      </w:r>
+      <w:r>
+        <w:rPr>
+          <w:rFonts w:ascii="Aptos" w:hAnsi="Aptos" w:eastAsia="Aptos" w:cs="Aptos"/>
+          <w:sz w:val="24"/>
+          <w:szCs w:val="24"/>
+        </w:rPr>
       </w:r>
       <w:r>
         <w:rPr>
@@ -4016,9 +4191,9 @@
     <w:lsdException w:name="Bibliography" w:uiPriority="37"/>
     <w:lsdException w:name="TOC Heading" w:uiPriority="39" w:qFormat="1"/>
   </w:latentStyles>
-  <w:style w:type="table" w:styleId="13">
+  <w:style w:type="table" w:styleId="723">
     <w:name w:val="Table Grid Light"/>
-    <w:basedOn w:val="733"/>
+    <w:basedOn w:val="901"/>
     <w:uiPriority w:val="59"/>
     <w:pPr>
       <w:pBdr/>
@@ -4215,9 +4390,9 @@
       </w:tcPr>
     </w:tblStylePr>
   </w:style>
-  <w:style w:type="table" w:styleId="14">
+  <w:style w:type="table" w:styleId="724">
     <w:name w:val="Plain Table 1"/>
-    <w:basedOn w:val="733"/>
+    <w:basedOn w:val="901"/>
     <w:uiPriority w:val="59"/>
     <w:pPr>
       <w:pBdr/>
@@ -4440,9 +4615,9 @@
       </w:tcPr>
     </w:tblStylePr>
   </w:style>
-  <w:style w:type="table" w:styleId="15">
+  <w:style w:type="table" w:styleId="725">
     <w:name w:val="Plain Table 2"/>
-    <w:basedOn w:val="733"/>
+    <w:basedOn w:val="901"/>
     <w:uiPriority w:val="59"/>
     <w:pPr>
       <w:pBdr/>
@@ -4673,9 +4848,9 @@
       </w:tcPr>
     </w:tblStylePr>
   </w:style>
-  <w:style w:type="table" w:styleId="16">
+  <w:style w:type="table" w:styleId="726">
     <w:name w:val="Plain Table 3"/>
-    <w:basedOn w:val="733"/>
+    <w:basedOn w:val="901"/>
     <w:uiPriority w:val="99"/>
     <w:pPr>
       <w:pBdr/>
@@ -4903,9 +5078,9 @@
       </w:tcPr>
     </w:tblStylePr>
   </w:style>
-  <w:style w:type="table" w:styleId="17">
+  <w:style w:type="table" w:styleId="727">
     <w:name w:val="Plain Table 4"/>
-    <w:basedOn w:val="733"/>
+    <w:basedOn w:val="901"/>
     <w:uiPriority w:val="99"/>
     <w:pPr>
       <w:pBdr/>
@@ -5119,9 +5294,9 @@
       </w:tcPr>
     </w:tblStylePr>
   </w:style>
-  <w:style w:type="table" w:styleId="18">
+  <w:style w:type="table" w:styleId="728">
     <w:name w:val="Plain Table 5"/>
-    <w:basedOn w:val="733"/>
+    <w:basedOn w:val="901"/>
     <w:uiPriority w:val="99"/>
     <w:pPr>
       <w:pBdr/>
@@ -5352,9 +5527,9 @@
       </w:tcPr>
     </w:tblStylePr>
   </w:style>
-  <w:style w:type="table" w:styleId="19">
+  <w:style w:type="table" w:styleId="729">
     <w:name w:val="Grid Table 1 Light"/>
-    <w:basedOn w:val="733"/>
+    <w:basedOn w:val="901"/>
     <w:uiPriority w:val="99"/>
     <w:pPr>
       <w:pBdr/>
@@ -5575,9 +5750,9 @@
       </w:tcPr>
     </w:tblStylePr>
   </w:style>
-  <w:style w:type="table" w:styleId="20">
+  <w:style w:type="table" w:styleId="730">
     <w:name w:val="Grid Table 1 Light - Accent 1"/>
-    <w:basedOn w:val="733"/>
+    <w:basedOn w:val="901"/>
     <w:uiPriority w:val="99"/>
     <w:pPr>
       <w:pBdr/>
@@ -5798,9 +5973,9 @@
       </w:tcPr>
     </w:tblStylePr>
   </w:style>
-  <w:style w:type="table" w:styleId="21">
+  <w:style w:type="table" w:styleId="731">
     <w:name w:val="Grid Table 1 Light - Accent 2"/>
-    <w:basedOn w:val="733"/>
+    <w:basedOn w:val="901"/>
     <w:uiPriority w:val="99"/>
     <w:pPr>
       <w:pBdr/>
@@ -6021,9 +6196,9 @@
       </w:tcPr>
     </w:tblStylePr>
   </w:style>
-  <w:style w:type="table" w:styleId="22">
+  <w:style w:type="table" w:styleId="732">
     <w:name w:val="Grid Table 1 Light - Accent 3"/>
-    <w:basedOn w:val="733"/>
+    <w:basedOn w:val="901"/>
     <w:uiPriority w:val="99"/>
     <w:pPr>
       <w:pBdr/>
@@ -6244,9 +6419,9 @@
       </w:tcPr>
     </w:tblStylePr>
   </w:style>
-  <w:style w:type="table" w:styleId="23">
+  <w:style w:type="table" w:styleId="733">
     <w:name w:val="Grid Table 1 Light - Accent 4"/>
-    <w:basedOn w:val="733"/>
+    <w:basedOn w:val="901"/>
     <w:uiPriority w:val="99"/>
     <w:pPr>
       <w:pBdr/>
@@ -6467,9 +6642,9 @@
       </w:tcPr>
     </w:tblStylePr>
   </w:style>
-  <w:style w:type="table" w:styleId="24">
+  <w:style w:type="table" w:styleId="734">
     <w:name w:val="Grid Table 1 Light - Accent 5"/>
-    <w:basedOn w:val="733"/>
+    <w:basedOn w:val="901"/>
     <w:uiPriority w:val="99"/>
     <w:pPr>
       <w:pBdr/>
@@ -6690,9 +6865,9 @@
       </w:tcPr>
     </w:tblStylePr>
   </w:style>
-  <w:style w:type="table" w:styleId="25">
+  <w:style w:type="table" w:styleId="735">
     <w:name w:val="Grid Table 1 Light - Accent 6"/>
-    <w:basedOn w:val="733"/>
+    <w:basedOn w:val="901"/>
     <w:uiPriority w:val="99"/>
     <w:pPr>
       <w:pBdr/>
@@ -6913,9 +7088,9 @@
       </w:tcPr>
     </w:tblStylePr>
   </w:style>
-  <w:style w:type="table" w:styleId="26">
+  <w:style w:type="table" w:styleId="736">
     <w:name w:val="Grid Table 2"/>
-    <w:basedOn w:val="733"/>
+    <w:basedOn w:val="901"/>
     <w:uiPriority w:val="99"/>
     <w:pPr>
       <w:pBdr/>
@@ -7145,9 +7320,9 @@
       </w:tcPr>
     </w:tblStylePr>
   </w:style>
-  <w:style w:type="table" w:styleId="27">
+  <w:style w:type="table" w:styleId="737">
     <w:name w:val="Grid Table 2 - Accent 1"/>
-    <w:basedOn w:val="733"/>
+    <w:basedOn w:val="901"/>
     <w:uiPriority w:val="99"/>
     <w:pPr>
       <w:pBdr/>
@@ -7377,9 +7552,9 @@
       </w:tcPr>
     </w:tblStylePr>
   </w:style>
-  <w:style w:type="table" w:styleId="28">
+  <w:style w:type="table" w:styleId="738">
     <w:name w:val="Grid Table 2 - Accent 2"/>
-    <w:basedOn w:val="733"/>
+    <w:basedOn w:val="901"/>
     <w:uiPriority w:val="99"/>
     <w:pPr>
       <w:pBdr/>
@@ -7609,9 +7784,9 @@
       </w:tcPr>
     </w:tblStylePr>
   </w:style>
-  <w:style w:type="table" w:styleId="29">
+  <w:style w:type="table" w:styleId="739">
     <w:name w:val="Grid Table 2 - Accent 3"/>
-    <w:basedOn w:val="733"/>
+    <w:basedOn w:val="901"/>
     <w:uiPriority w:val="99"/>
     <w:pPr>
       <w:pBdr/>
@@ -7841,9 +8016,9 @@
       </w:tcPr>
     </w:tblStylePr>
   </w:style>
-  <w:style w:type="table" w:styleId="30">
+  <w:style w:type="table" w:styleId="740">
     <w:name w:val="Grid Table 2 - Accent 4"/>
-    <w:basedOn w:val="733"/>
+    <w:basedOn w:val="901"/>
     <w:uiPriority w:val="99"/>
     <w:pPr>
       <w:pBdr/>
@@ -8073,9 +8248,9 @@
       </w:tcPr>
     </w:tblStylePr>
   </w:style>
-  <w:style w:type="table" w:styleId="31">
+  <w:style w:type="table" w:styleId="741">
     <w:name w:val="Grid Table 2 - Accent 5"/>
-    <w:basedOn w:val="733"/>
+    <w:basedOn w:val="901"/>
     <w:uiPriority w:val="99"/>
     <w:pPr>
       <w:pBdr/>
@@ -8305,9 +8480,9 @@
       </w:tcPr>
     </w:tblStylePr>
   </w:style>
-  <w:style w:type="table" w:styleId="32">
+  <w:style w:type="table" w:styleId="742">
     <w:name w:val="Grid Table 2 - Accent 6"/>
-    <w:basedOn w:val="733"/>
+    <w:basedOn w:val="901"/>
     <w:uiPriority w:val="99"/>
     <w:pPr>
       <w:pBdr/>
@@ -8537,9 +8712,9 @@
       </w:tcPr>
     </w:tblStylePr>
   </w:style>
-  <w:style w:type="table" w:styleId="33">
+  <w:style w:type="table" w:styleId="743">
     <w:name w:val="Grid Table 3"/>
-    <w:basedOn w:val="733"/>
+    <w:basedOn w:val="901"/>
     <w:uiPriority w:val="99"/>
     <w:pPr>
       <w:pBdr/>
@@ -8638,29 +8813,6 @@
         <w:tblBorders/>
       </w:tblPr>
       <w:tcPr>
-        <w:shd w:color="ffffff"/>
-        <w:tcBorders>
-          <w:top w:val="none" w:color="000000" w:sz="4" w:space="0"/>
-          <w:left w:val="none" w:color="000000" w:sz="4" w:space="0"/>
-          <w:bottom w:val="none" w:color="000000" w:sz="4" w:space="0"/>
-          <w:right w:val="none" w:color="000000" w:sz="4" w:space="0"/>
-        </w:tcBorders>
-      </w:tcPr>
-    </w:tblStylePr>
-    <w:tblStylePr w:type="firstRow">
-      <w:rPr>
-        <w:b/>
-        <w:color w:val="404040"/>
-      </w:rPr>
-      <w:pPr>
-        <w:pBdr/>
-        <w:spacing/>
-        <w:ind/>
-      </w:pPr>
-      <w:tblPr>
-        <w:tblBorders/>
-      </w:tblPr>
-      <w:tcPr>
         <w:shd w:val="clear" w:color="ffffff"/>
         <w:tcBorders>
           <w:top w:val="none" w:color="000000" w:sz="4" w:space="0"/>
@@ -8670,30 +8822,7 @@
         </w:tcBorders>
       </w:tcPr>
     </w:tblStylePr>
-    <w:tblStylePr w:type="lastCol">
-      <w:rPr>
-        <w:i/>
-        <w:color w:val="404040"/>
-      </w:rPr>
-      <w:pPr>
-        <w:pBdr/>
-        <w:spacing/>
-        <w:ind/>
-      </w:pPr>
-      <w:tblPr>
-        <w:tblBorders/>
-      </w:tblPr>
-      <w:tcPr>
-        <w:shd w:color="ffffff"/>
-        <w:tcBorders>
-          <w:top w:val="none" w:color="000000" w:sz="4" w:space="0"/>
-          <w:left w:val="none" w:color="000000" w:sz="4" w:space="0"/>
-          <w:bottom w:val="none" w:color="000000" w:sz="4" w:space="0"/>
-          <w:right w:val="none" w:color="000000" w:sz="4" w:space="0"/>
-        </w:tcBorders>
-      </w:tcPr>
-    </w:tblStylePr>
-    <w:tblStylePr w:type="lastRow">
+    <w:tblStylePr w:type="firstRow">
       <w:rPr>
         <w:b/>
         <w:color w:val="404040"/>
@@ -8716,6 +8845,52 @@
         </w:tcBorders>
       </w:tcPr>
     </w:tblStylePr>
+    <w:tblStylePr w:type="lastCol">
+      <w:rPr>
+        <w:i/>
+        <w:color w:val="404040"/>
+      </w:rPr>
+      <w:pPr>
+        <w:pBdr/>
+        <w:spacing/>
+        <w:ind/>
+      </w:pPr>
+      <w:tblPr>
+        <w:tblBorders/>
+      </w:tblPr>
+      <w:tcPr>
+        <w:shd w:val="clear" w:color="ffffff"/>
+        <w:tcBorders>
+          <w:top w:val="none" w:color="000000" w:sz="4" w:space="0"/>
+          <w:left w:val="none" w:color="000000" w:sz="4" w:space="0"/>
+          <w:bottom w:val="none" w:color="000000" w:sz="4" w:space="0"/>
+          <w:right w:val="none" w:color="000000" w:sz="4" w:space="0"/>
+        </w:tcBorders>
+      </w:tcPr>
+    </w:tblStylePr>
+    <w:tblStylePr w:type="lastRow">
+      <w:rPr>
+        <w:b/>
+        <w:color w:val="404040"/>
+      </w:rPr>
+      <w:pPr>
+        <w:pBdr/>
+        <w:spacing/>
+        <w:ind/>
+      </w:pPr>
+      <w:tblPr>
+        <w:tblBorders/>
+      </w:tblPr>
+      <w:tcPr>
+        <w:shd w:val="clear" w:color="ffffff"/>
+        <w:tcBorders>
+          <w:top w:val="none" w:color="000000" w:sz="4" w:space="0"/>
+          <w:left w:val="none" w:color="000000" w:sz="4" w:space="0"/>
+          <w:bottom w:val="none" w:color="000000" w:sz="4" w:space="0"/>
+          <w:right w:val="none" w:color="000000" w:sz="4" w:space="0"/>
+        </w:tcBorders>
+      </w:tcPr>
+    </w:tblStylePr>
     <w:tblStylePr w:type="nwCell">
       <w:pPr>
         <w:pBdr/>
@@ -8782,9 +8957,9 @@
       </w:tcPr>
     </w:tblStylePr>
   </w:style>
-  <w:style w:type="table" w:styleId="34">
+  <w:style w:type="table" w:styleId="744">
     <w:name w:val="Grid Table 3 - Accent 1"/>
-    <w:basedOn w:val="733"/>
+    <w:basedOn w:val="901"/>
     <w:uiPriority w:val="99"/>
     <w:pPr>
       <w:pBdr/>
@@ -8883,29 +9058,6 @@
         <w:tblBorders/>
       </w:tblPr>
       <w:tcPr>
-        <w:shd w:color="ffffff"/>
-        <w:tcBorders>
-          <w:top w:val="none" w:color="000000" w:sz="4" w:space="0"/>
-          <w:left w:val="none" w:color="000000" w:sz="4" w:space="0"/>
-          <w:bottom w:val="none" w:color="000000" w:sz="4" w:space="0"/>
-          <w:right w:val="none" w:color="000000" w:sz="4" w:space="0"/>
-        </w:tcBorders>
-      </w:tcPr>
-    </w:tblStylePr>
-    <w:tblStylePr w:type="firstRow">
-      <w:rPr>
-        <w:b/>
-        <w:color w:val="404040"/>
-      </w:rPr>
-      <w:pPr>
-        <w:pBdr/>
-        <w:spacing/>
-        <w:ind/>
-      </w:pPr>
-      <w:tblPr>
-        <w:tblBorders/>
-      </w:tblPr>
-      <w:tcPr>
         <w:shd w:val="clear" w:color="ffffff"/>
         <w:tcBorders>
           <w:top w:val="none" w:color="000000" w:sz="4" w:space="0"/>
@@ -8915,30 +9067,7 @@
         </w:tcBorders>
       </w:tcPr>
     </w:tblStylePr>
-    <w:tblStylePr w:type="lastCol">
-      <w:rPr>
-        <w:i/>
-        <w:color w:val="404040"/>
-      </w:rPr>
-      <w:pPr>
-        <w:pBdr/>
-        <w:spacing/>
-        <w:ind/>
-      </w:pPr>
-      <w:tblPr>
-        <w:tblBorders/>
-      </w:tblPr>
-      <w:tcPr>
-        <w:shd w:color="ffffff"/>
-        <w:tcBorders>
-          <w:top w:val="none" w:color="000000" w:sz="4" w:space="0"/>
-          <w:left w:val="none" w:color="000000" w:sz="4" w:space="0"/>
-          <w:bottom w:val="none" w:color="000000" w:sz="4" w:space="0"/>
-          <w:right w:val="none" w:color="000000" w:sz="4" w:space="0"/>
-        </w:tcBorders>
-      </w:tcPr>
-    </w:tblStylePr>
-    <w:tblStylePr w:type="lastRow">
+    <w:tblStylePr w:type="firstRow">
       <w:rPr>
         <w:b/>
         <w:color w:val="404040"/>
@@ -8961,6 +9090,52 @@
         </w:tcBorders>
       </w:tcPr>
     </w:tblStylePr>
+    <w:tblStylePr w:type="lastCol">
+      <w:rPr>
+        <w:i/>
+        <w:color w:val="404040"/>
+      </w:rPr>
+      <w:pPr>
+        <w:pBdr/>
+        <w:spacing/>
+        <w:ind/>
+      </w:pPr>
+      <w:tblPr>
+        <w:tblBorders/>
+      </w:tblPr>
+      <w:tcPr>
+        <w:shd w:val="clear" w:color="ffffff"/>
+        <w:tcBorders>
+          <w:top w:val="none" w:color="000000" w:sz="4" w:space="0"/>
+          <w:left w:val="none" w:color="000000" w:sz="4" w:space="0"/>
+          <w:bottom w:val="none" w:color="000000" w:sz="4" w:space="0"/>
+          <w:right w:val="none" w:color="000000" w:sz="4" w:space="0"/>
+        </w:tcBorders>
+      </w:tcPr>
+    </w:tblStylePr>
+    <w:tblStylePr w:type="lastRow">
+      <w:rPr>
+        <w:b/>
+        <w:color w:val="404040"/>
+      </w:rPr>
+      <w:pPr>
+        <w:pBdr/>
+        <w:spacing/>
+        <w:ind/>
+      </w:pPr>
+      <w:tblPr>
+        <w:tblBorders/>
+      </w:tblPr>
+      <w:tcPr>
+        <w:shd w:val="clear" w:color="ffffff"/>
+        <w:tcBorders>
+          <w:top w:val="none" w:color="000000" w:sz="4" w:space="0"/>
+          <w:left w:val="none" w:color="000000" w:sz="4" w:space="0"/>
+          <w:bottom w:val="none" w:color="000000" w:sz="4" w:space="0"/>
+          <w:right w:val="none" w:color="000000" w:sz="4" w:space="0"/>
+        </w:tcBorders>
+      </w:tcPr>
+    </w:tblStylePr>
     <w:tblStylePr w:type="nwCell">
       <w:pPr>
         <w:pBdr/>
@@ -9027,9 +9202,9 @@
       </w:tcPr>
     </w:tblStylePr>
   </w:style>
-  <w:style w:type="table" w:styleId="35">
+  <w:style w:type="table" w:styleId="745">
     <w:name w:val="Grid Table 3 - Accent 2"/>
-    <w:basedOn w:val="733"/>
+    <w:basedOn w:val="901"/>
     <w:uiPriority w:val="99"/>
     <w:pPr>
       <w:pBdr/>
@@ -9128,29 +9303,6 @@
         <w:tblBorders/>
       </w:tblPr>
       <w:tcPr>
-        <w:shd w:color="ffffff"/>
-        <w:tcBorders>
-          <w:top w:val="none" w:color="000000" w:sz="4" w:space="0"/>
-          <w:left w:val="none" w:color="000000" w:sz="4" w:space="0"/>
-          <w:bottom w:val="none" w:color="000000" w:sz="4" w:space="0"/>
-          <w:right w:val="none" w:color="000000" w:sz="4" w:space="0"/>
-        </w:tcBorders>
-      </w:tcPr>
-    </w:tblStylePr>
-    <w:tblStylePr w:type="firstRow">
-      <w:rPr>
-        <w:b/>
-        <w:color w:val="404040"/>
-      </w:rPr>
-      <w:pPr>
-        <w:pBdr/>
-        <w:spacing/>
-        <w:ind/>
-      </w:pPr>
-      <w:tblPr>
-        <w:tblBorders/>
-      </w:tblPr>
-      <w:tcPr>
         <w:shd w:val="clear" w:color="ffffff"/>
         <w:tcBorders>
           <w:top w:val="none" w:color="000000" w:sz="4" w:space="0"/>
@@ -9160,30 +9312,7 @@
         </w:tcBorders>
       </w:tcPr>
     </w:tblStylePr>
-    <w:tblStylePr w:type="lastCol">
-      <w:rPr>
-        <w:i/>
-        <w:color w:val="404040"/>
-      </w:rPr>
-      <w:pPr>
-        <w:pBdr/>
-        <w:spacing/>
-        <w:ind/>
-      </w:pPr>
-      <w:tblPr>
-        <w:tblBorders/>
-      </w:tblPr>
-      <w:tcPr>
-        <w:shd w:color="ffffff"/>
-        <w:tcBorders>
-          <w:top w:val="none" w:color="000000" w:sz="4" w:space="0"/>
-          <w:left w:val="none" w:color="000000" w:sz="4" w:space="0"/>
-          <w:bottom w:val="none" w:color="000000" w:sz="4" w:space="0"/>
-          <w:right w:val="none" w:color="000000" w:sz="4" w:space="0"/>
-        </w:tcBorders>
-      </w:tcPr>
-    </w:tblStylePr>
-    <w:tblStylePr w:type="lastRow">
+    <w:tblStylePr w:type="firstRow">
       <w:rPr>
         <w:b/>
         <w:color w:val="404040"/>
@@ -9206,6 +9335,52 @@
         </w:tcBorders>
       </w:tcPr>
     </w:tblStylePr>
+    <w:tblStylePr w:type="lastCol">
+      <w:rPr>
+        <w:i/>
+        <w:color w:val="404040"/>
+      </w:rPr>
+      <w:pPr>
+        <w:pBdr/>
+        <w:spacing/>
+        <w:ind/>
+      </w:pPr>
+      <w:tblPr>
+        <w:tblBorders/>
+      </w:tblPr>
+      <w:tcPr>
+        <w:shd w:val="clear" w:color="ffffff"/>
+        <w:tcBorders>
+          <w:top w:val="none" w:color="000000" w:sz="4" w:space="0"/>
+          <w:left w:val="none" w:color="000000" w:sz="4" w:space="0"/>
+          <w:bottom w:val="none" w:color="000000" w:sz="4" w:space="0"/>
+          <w:right w:val="none" w:color="000000" w:sz="4" w:space="0"/>
+        </w:tcBorders>
+      </w:tcPr>
+    </w:tblStylePr>
+    <w:tblStylePr w:type="lastRow">
+      <w:rPr>
+        <w:b/>
+        <w:color w:val="404040"/>
+      </w:rPr>
+      <w:pPr>
+        <w:pBdr/>
+        <w:spacing/>
+        <w:ind/>
+      </w:pPr>
+      <w:tblPr>
+        <w:tblBorders/>
+      </w:tblPr>
+      <w:tcPr>
+        <w:shd w:val="clear" w:color="ffffff"/>
+        <w:tcBorders>
+          <w:top w:val="none" w:color="000000" w:sz="4" w:space="0"/>
+          <w:left w:val="none" w:color="000000" w:sz="4" w:space="0"/>
+          <w:bottom w:val="none" w:color="000000" w:sz="4" w:space="0"/>
+          <w:right w:val="none" w:color="000000" w:sz="4" w:space="0"/>
+        </w:tcBorders>
+      </w:tcPr>
+    </w:tblStylePr>
     <w:tblStylePr w:type="nwCell">
       <w:pPr>
         <w:pBdr/>
@@ -9272,9 +9447,9 @@
       </w:tcPr>
     </w:tblStylePr>
   </w:style>
-  <w:style w:type="table" w:styleId="36">
+  <w:style w:type="table" w:styleId="746">
     <w:name w:val="Grid Table 3 - Accent 3"/>
-    <w:basedOn w:val="733"/>
+    <w:basedOn w:val="901"/>
     <w:uiPriority w:val="99"/>
     <w:pPr>
       <w:pBdr/>
@@ -9373,29 +9548,6 @@
         <w:tblBorders/>
       </w:tblPr>
       <w:tcPr>
-        <w:shd w:color="ffffff"/>
-        <w:tcBorders>
-          <w:top w:val="none" w:color="000000" w:sz="4" w:space="0"/>
-          <w:left w:val="none" w:color="000000" w:sz="4" w:space="0"/>
-          <w:bottom w:val="none" w:color="000000" w:sz="4" w:space="0"/>
-          <w:right w:val="none" w:color="000000" w:sz="4" w:space="0"/>
-        </w:tcBorders>
-      </w:tcPr>
-    </w:tblStylePr>
-    <w:tblStylePr w:type="firstRow">
-      <w:rPr>
-        <w:b/>
-        <w:color w:val="404040"/>
-      </w:rPr>
-      <w:pPr>
-        <w:pBdr/>
-        <w:spacing/>
-        <w:ind/>
-      </w:pPr>
-      <w:tblPr>
-        <w:tblBorders/>
-      </w:tblPr>
-      <w:tcPr>
         <w:shd w:val="clear" w:color="ffffff"/>
         <w:tcBorders>
           <w:top w:val="none" w:color="000000" w:sz="4" w:space="0"/>
@@ -9405,30 +9557,7 @@
         </w:tcBorders>
       </w:tcPr>
     </w:tblStylePr>
-    <w:tblStylePr w:type="lastCol">
-      <w:rPr>
-        <w:i/>
-        <w:color w:val="404040"/>
-      </w:rPr>
-      <w:pPr>
-        <w:pBdr/>
-        <w:spacing/>
-        <w:ind/>
-      </w:pPr>
-      <w:tblPr>
-        <w:tblBorders/>
-      </w:tblPr>
-      <w:tcPr>
-        <w:shd w:color="ffffff"/>
-        <w:tcBorders>
-          <w:top w:val="none" w:color="000000" w:sz="4" w:space="0"/>
-          <w:left w:val="none" w:color="000000" w:sz="4" w:space="0"/>
-          <w:bottom w:val="none" w:color="000000" w:sz="4" w:space="0"/>
-          <w:right w:val="none" w:color="000000" w:sz="4" w:space="0"/>
-        </w:tcBorders>
-      </w:tcPr>
-    </w:tblStylePr>
-    <w:tblStylePr w:type="lastRow">
+    <w:tblStylePr w:type="firstRow">
       <w:rPr>
         <w:b/>
         <w:color w:val="404040"/>
@@ -9451,6 +9580,52 @@
         </w:tcBorders>
       </w:tcPr>
     </w:tblStylePr>
+    <w:tblStylePr w:type="lastCol">
+      <w:rPr>
+        <w:i/>
+        <w:color w:val="404040"/>
+      </w:rPr>
+      <w:pPr>
+        <w:pBdr/>
+        <w:spacing/>
+        <w:ind/>
+      </w:pPr>
+      <w:tblPr>
+        <w:tblBorders/>
+      </w:tblPr>
+      <w:tcPr>
+        <w:shd w:val="clear" w:color="ffffff"/>
+        <w:tcBorders>
+          <w:top w:val="none" w:color="000000" w:sz="4" w:space="0"/>
+          <w:left w:val="none" w:color="000000" w:sz="4" w:space="0"/>
+          <w:bottom w:val="none" w:color="000000" w:sz="4" w:space="0"/>
+          <w:right w:val="none" w:color="000000" w:sz="4" w:space="0"/>
+        </w:tcBorders>
+      </w:tcPr>
+    </w:tblStylePr>
+    <w:tblStylePr w:type="lastRow">
+      <w:rPr>
+        <w:b/>
+        <w:color w:val="404040"/>
+      </w:rPr>
+      <w:pPr>
+        <w:pBdr/>
+        <w:spacing/>
+        <w:ind/>
+      </w:pPr>
+      <w:tblPr>
+        <w:tblBorders/>
+      </w:tblPr>
+      <w:tcPr>
+        <w:shd w:val="clear" w:color="ffffff"/>
+        <w:tcBorders>
+          <w:top w:val="none" w:color="000000" w:sz="4" w:space="0"/>
+          <w:left w:val="none" w:color="000000" w:sz="4" w:space="0"/>
+          <w:bottom w:val="none" w:color="000000" w:sz="4" w:space="0"/>
+          <w:right w:val="none" w:color="000000" w:sz="4" w:space="0"/>
+        </w:tcBorders>
+      </w:tcPr>
+    </w:tblStylePr>
     <w:tblStylePr w:type="nwCell">
       <w:pPr>
         <w:pBdr/>
@@ -9517,9 +9692,9 @@
       </w:tcPr>
     </w:tblStylePr>
   </w:style>
-  <w:style w:type="table" w:styleId="37">
+  <w:style w:type="table" w:styleId="747">
     <w:name w:val="Grid Table 3 - Accent 4"/>
-    <w:basedOn w:val="733"/>
+    <w:basedOn w:val="901"/>
     <w:uiPriority w:val="99"/>
     <w:pPr>
       <w:pBdr/>
@@ -9618,29 +9793,6 @@
         <w:tblBorders/>
       </w:tblPr>
       <w:tcPr>
-        <w:shd w:color="ffffff"/>
-        <w:tcBorders>
-          <w:top w:val="none" w:color="000000" w:sz="4" w:space="0"/>
-          <w:left w:val="none" w:color="000000" w:sz="4" w:space="0"/>
-          <w:bottom w:val="none" w:color="000000" w:sz="4" w:space="0"/>
-          <w:right w:val="none" w:color="000000" w:sz="4" w:space="0"/>
-        </w:tcBorders>
-      </w:tcPr>
-    </w:tblStylePr>
-    <w:tblStylePr w:type="firstRow">
-      <w:rPr>
-        <w:b/>
-        <w:color w:val="404040"/>
-      </w:rPr>
-      <w:pPr>
-        <w:pBdr/>
-        <w:spacing/>
-        <w:ind/>
-      </w:pPr>
-      <w:tblPr>
-        <w:tblBorders/>
-      </w:tblPr>
-      <w:tcPr>
         <w:shd w:val="clear" w:color="ffffff"/>
         <w:tcBorders>
           <w:top w:val="none" w:color="000000" w:sz="4" w:space="0"/>
@@ -9650,30 +9802,7 @@
         </w:tcBorders>
       </w:tcPr>
     </w:tblStylePr>
-    <w:tblStylePr w:type="lastCol">
-      <w:rPr>
-        <w:i/>
-        <w:color w:val="404040"/>
-      </w:rPr>
-      <w:pPr>
-        <w:pBdr/>
-        <w:spacing/>
-        <w:ind/>
-      </w:pPr>
-      <w:tblPr>
-        <w:tblBorders/>
-      </w:tblPr>
-      <w:tcPr>
-        <w:shd w:color="ffffff"/>
-        <w:tcBorders>
-          <w:top w:val="none" w:color="000000" w:sz="4" w:space="0"/>
-          <w:left w:val="none" w:color="000000" w:sz="4" w:space="0"/>
-          <w:bottom w:val="none" w:color="000000" w:sz="4" w:space="0"/>
-          <w:right w:val="none" w:color="000000" w:sz="4" w:space="0"/>
-        </w:tcBorders>
-      </w:tcPr>
-    </w:tblStylePr>
-    <w:tblStylePr w:type="lastRow">
+    <w:tblStylePr w:type="firstRow">
       <w:rPr>
         <w:b/>
         <w:color w:val="404040"/>
@@ -9696,6 +9825,52 @@
         </w:tcBorders>
       </w:tcPr>
     </w:tblStylePr>
+    <w:tblStylePr w:type="lastCol">
+      <w:rPr>
+        <w:i/>
+        <w:color w:val="404040"/>
+      </w:rPr>
+      <w:pPr>
+        <w:pBdr/>
+        <w:spacing/>
+        <w:ind/>
+      </w:pPr>
+      <w:tblPr>
+        <w:tblBorders/>
+      </w:tblPr>
+      <w:tcPr>
+        <w:shd w:val="clear" w:color="ffffff"/>
+        <w:tcBorders>
+          <w:top w:val="none" w:color="000000" w:sz="4" w:space="0"/>
+          <w:left w:val="none" w:color="000000" w:sz="4" w:space="0"/>
+          <w:bottom w:val="none" w:color="000000" w:sz="4" w:space="0"/>
+          <w:right w:val="none" w:color="000000" w:sz="4" w:space="0"/>
+        </w:tcBorders>
+      </w:tcPr>
+    </w:tblStylePr>
+    <w:tblStylePr w:type="lastRow">
+      <w:rPr>
+        <w:b/>
+        <w:color w:val="404040"/>
+      </w:rPr>
+      <w:pPr>
+        <w:pBdr/>
+        <w:spacing/>
+        <w:ind/>
+      </w:pPr>
+      <w:tblPr>
+        <w:tblBorders/>
+      </w:tblPr>
+      <w:tcPr>
+        <w:shd w:val="clear" w:color="ffffff"/>
+        <w:tcBorders>
+          <w:top w:val="none" w:color="000000" w:sz="4" w:space="0"/>
+          <w:left w:val="none" w:color="000000" w:sz="4" w:space="0"/>
+          <w:bottom w:val="none" w:color="000000" w:sz="4" w:space="0"/>
+          <w:right w:val="none" w:color="000000" w:sz="4" w:space="0"/>
+        </w:tcBorders>
+      </w:tcPr>
+    </w:tblStylePr>
     <w:tblStylePr w:type="nwCell">
       <w:pPr>
         <w:pBdr/>
@@ -9762,9 +9937,9 @@
       </w:tcPr>
     </w:tblStylePr>
   </w:style>
-  <w:style w:type="table" w:styleId="38">
+  <w:style w:type="table" w:styleId="748">
     <w:name w:val="Grid Table 3 - Accent 5"/>
-    <w:basedOn w:val="733"/>
+    <w:basedOn w:val="901"/>
     <w:uiPriority w:val="99"/>
     <w:pPr>
       <w:pBdr/>
@@ -9863,29 +10038,6 @@
         <w:tblBorders/>
       </w:tblPr>
       <w:tcPr>
-        <w:shd w:color="ffffff"/>
-        <w:tcBorders>
-          <w:top w:val="none" w:color="000000" w:sz="4" w:space="0"/>
-          <w:left w:val="none" w:color="000000" w:sz="4" w:space="0"/>
-          <w:bottom w:val="none" w:color="000000" w:sz="4" w:space="0"/>
-          <w:right w:val="none" w:color="000000" w:sz="4" w:space="0"/>
-        </w:tcBorders>
-      </w:tcPr>
-    </w:tblStylePr>
-    <w:tblStylePr w:type="firstRow">
-      <w:rPr>
-        <w:b/>
-        <w:color w:val="404040"/>
-      </w:rPr>
-      <w:pPr>
-        <w:pBdr/>
-        <w:spacing/>
-        <w:ind/>
-      </w:pPr>
-      <w:tblPr>
-        <w:tblBorders/>
-      </w:tblPr>
-      <w:tcPr>
         <w:shd w:val="clear" w:color="ffffff"/>
         <w:tcBorders>
           <w:top w:val="none" w:color="000000" w:sz="4" w:space="0"/>
@@ -9895,30 +10047,7 @@
         </w:tcBorders>
       </w:tcPr>
     </w:tblStylePr>
-    <w:tblStylePr w:type="lastCol">
-      <w:rPr>
-        <w:i/>
-        <w:color w:val="404040"/>
-      </w:rPr>
-      <w:pPr>
-        <w:pBdr/>
-        <w:spacing/>
-        <w:ind/>
-      </w:pPr>
-      <w:tblPr>
-        <w:tblBorders/>
-      </w:tblPr>
-      <w:tcPr>
-        <w:shd w:color="ffffff"/>
-        <w:tcBorders>
-          <w:top w:val="none" w:color="000000" w:sz="4" w:space="0"/>
-          <w:left w:val="none" w:color="000000" w:sz="4" w:space="0"/>
-          <w:bottom w:val="none" w:color="000000" w:sz="4" w:space="0"/>
-          <w:right w:val="none" w:color="000000" w:sz="4" w:space="0"/>
-        </w:tcBorders>
-      </w:tcPr>
-    </w:tblStylePr>
-    <w:tblStylePr w:type="lastRow">
+    <w:tblStylePr w:type="firstRow">
       <w:rPr>
         <w:b/>
         <w:color w:val="404040"/>
@@ -9941,6 +10070,52 @@
         </w:tcBorders>
       </w:tcPr>
     </w:tblStylePr>
+    <w:tblStylePr w:type="lastCol">
+      <w:rPr>
+        <w:i/>
+        <w:color w:val="404040"/>
+      </w:rPr>
+      <w:pPr>
+        <w:pBdr/>
+        <w:spacing/>
+        <w:ind/>
+      </w:pPr>
+      <w:tblPr>
+        <w:tblBorders/>
+      </w:tblPr>
+      <w:tcPr>
+        <w:shd w:val="clear" w:color="ffffff"/>
+        <w:tcBorders>
+          <w:top w:val="none" w:color="000000" w:sz="4" w:space="0"/>
+          <w:left w:val="none" w:color="000000" w:sz="4" w:space="0"/>
+          <w:bottom w:val="none" w:color="000000" w:sz="4" w:space="0"/>
+          <w:right w:val="none" w:color="000000" w:sz="4" w:space="0"/>
+        </w:tcBorders>
+      </w:tcPr>
+    </w:tblStylePr>
+    <w:tblStylePr w:type="lastRow">
+      <w:rPr>
+        <w:b/>
+        <w:color w:val="404040"/>
+      </w:rPr>
+      <w:pPr>
+        <w:pBdr/>
+        <w:spacing/>
+        <w:ind/>
+      </w:pPr>
+      <w:tblPr>
+        <w:tblBorders/>
+      </w:tblPr>
+      <w:tcPr>
+        <w:shd w:val="clear" w:color="ffffff"/>
+        <w:tcBorders>
+          <w:top w:val="none" w:color="000000" w:sz="4" w:space="0"/>
+          <w:left w:val="none" w:color="000000" w:sz="4" w:space="0"/>
+          <w:bottom w:val="none" w:color="000000" w:sz="4" w:space="0"/>
+          <w:right w:val="none" w:color="000000" w:sz="4" w:space="0"/>
+        </w:tcBorders>
+      </w:tcPr>
+    </w:tblStylePr>
     <w:tblStylePr w:type="nwCell">
       <w:pPr>
         <w:pBdr/>
@@ -10007,9 +10182,9 @@
       </w:tcPr>
     </w:tblStylePr>
   </w:style>
-  <w:style w:type="table" w:styleId="39">
+  <w:style w:type="table" w:styleId="749">
     <w:name w:val="Grid Table 3 - Accent 6"/>
-    <w:basedOn w:val="733"/>
+    <w:basedOn w:val="901"/>
     <w:uiPriority w:val="99"/>
     <w:pPr>
       <w:pBdr/>
@@ -10108,29 +10283,6 @@
         <w:tblBorders/>
       </w:tblPr>
       <w:tcPr>
-        <w:shd w:color="ffffff"/>
-        <w:tcBorders>
-          <w:top w:val="none" w:color="000000" w:sz="4" w:space="0"/>
-          <w:left w:val="none" w:color="000000" w:sz="4" w:space="0"/>
-          <w:bottom w:val="none" w:color="000000" w:sz="4" w:space="0"/>
-          <w:right w:val="none" w:color="000000" w:sz="4" w:space="0"/>
-        </w:tcBorders>
-      </w:tcPr>
-    </w:tblStylePr>
-    <w:tblStylePr w:type="firstRow">
-      <w:rPr>
-        <w:b/>
-        <w:color w:val="404040"/>
-      </w:rPr>
-      <w:pPr>
-        <w:pBdr/>
-        <w:spacing/>
-        <w:ind/>
-      </w:pPr>
-      <w:tblPr>
-        <w:tblBorders/>
-      </w:tblPr>
-      <w:tcPr>
         <w:shd w:val="clear" w:color="ffffff"/>
         <w:tcBorders>
           <w:top w:val="none" w:color="000000" w:sz="4" w:space="0"/>
@@ -10140,30 +10292,7 @@
         </w:tcBorders>
       </w:tcPr>
     </w:tblStylePr>
-    <w:tblStylePr w:type="lastCol">
-      <w:rPr>
-        <w:i/>
-        <w:color w:val="404040"/>
-      </w:rPr>
-      <w:pPr>
-        <w:pBdr/>
-        <w:spacing/>
-        <w:ind/>
-      </w:pPr>
-      <w:tblPr>
-        <w:tblBorders/>
-      </w:tblPr>
-      <w:tcPr>
-        <w:shd w:color="ffffff"/>
-        <w:tcBorders>
-          <w:top w:val="none" w:color="000000" w:sz="4" w:space="0"/>
-          <w:left w:val="none" w:color="000000" w:sz="4" w:space="0"/>
-          <w:bottom w:val="none" w:color="000000" w:sz="4" w:space="0"/>
-          <w:right w:val="none" w:color="000000" w:sz="4" w:space="0"/>
-        </w:tcBorders>
-      </w:tcPr>
-    </w:tblStylePr>
-    <w:tblStylePr w:type="lastRow">
+    <w:tblStylePr w:type="firstRow">
       <w:rPr>
         <w:b/>
         <w:color w:val="404040"/>
@@ -10186,6 +10315,52 @@
         </w:tcBorders>
       </w:tcPr>
     </w:tblStylePr>
+    <w:tblStylePr w:type="lastCol">
+      <w:rPr>
+        <w:i/>
+        <w:color w:val="404040"/>
+      </w:rPr>
+      <w:pPr>
+        <w:pBdr/>
+        <w:spacing/>
+        <w:ind/>
+      </w:pPr>
+      <w:tblPr>
+        <w:tblBorders/>
+      </w:tblPr>
+      <w:tcPr>
+        <w:shd w:val="clear" w:color="ffffff"/>
+        <w:tcBorders>
+          <w:top w:val="none" w:color="000000" w:sz="4" w:space="0"/>
+          <w:left w:val="none" w:color="000000" w:sz="4" w:space="0"/>
+          <w:bottom w:val="none" w:color="000000" w:sz="4" w:space="0"/>
+          <w:right w:val="none" w:color="000000" w:sz="4" w:space="0"/>
+        </w:tcBorders>
+      </w:tcPr>
+    </w:tblStylePr>
+    <w:tblStylePr w:type="lastRow">
+      <w:rPr>
+        <w:b/>
+        <w:color w:val="404040"/>
+      </w:rPr>
+      <w:pPr>
+        <w:pBdr/>
+        <w:spacing/>
+        <w:ind/>
+      </w:pPr>
+      <w:tblPr>
+        <w:tblBorders/>
+      </w:tblPr>
+      <w:tcPr>
+        <w:shd w:val="clear" w:color="ffffff"/>
+        <w:tcBorders>
+          <w:top w:val="none" w:color="000000" w:sz="4" w:space="0"/>
+          <w:left w:val="none" w:color="000000" w:sz="4" w:space="0"/>
+          <w:bottom w:val="none" w:color="000000" w:sz="4" w:space="0"/>
+          <w:right w:val="none" w:color="000000" w:sz="4" w:space="0"/>
+        </w:tcBorders>
+      </w:tcPr>
+    </w:tblStylePr>
     <w:tblStylePr w:type="nwCell">
       <w:pPr>
         <w:pBdr/>
@@ -10252,9 +10427,9 @@
       </w:tcPr>
     </w:tblStylePr>
   </w:style>
-  <w:style w:type="table" w:styleId="40">
+  <w:style w:type="table" w:styleId="750">
     <w:name w:val="Grid Table 4"/>
-    <w:basedOn w:val="733"/>
+    <w:basedOn w:val="901"/>
     <w:uiPriority w:val="59"/>
     <w:pPr>
       <w:pBdr/>
@@ -10485,9 +10660,9 @@
       </w:tcPr>
     </w:tblStylePr>
   </w:style>
-  <w:style w:type="table" w:styleId="41">
+  <w:style w:type="table" w:styleId="751">
     <w:name w:val="Grid Table 4 - Accent 1"/>
-    <w:basedOn w:val="733"/>
+    <w:basedOn w:val="901"/>
     <w:uiPriority w:val="59"/>
     <w:pPr>
       <w:pBdr/>
@@ -10718,9 +10893,9 @@
       </w:tcPr>
     </w:tblStylePr>
   </w:style>
-  <w:style w:type="table" w:styleId="42">
+  <w:style w:type="table" w:styleId="752">
     <w:name w:val="Grid Table 4 - Accent 2"/>
-    <w:basedOn w:val="733"/>
+    <w:basedOn w:val="901"/>
     <w:uiPriority w:val="59"/>
     <w:pPr>
       <w:pBdr/>
@@ -10951,9 +11126,9 @@
       </w:tcPr>
     </w:tblStylePr>
   </w:style>
-  <w:style w:type="table" w:styleId="43">
+  <w:style w:type="table" w:styleId="753">
     <w:name w:val="Grid Table 4 - Accent 3"/>
-    <w:basedOn w:val="733"/>
+    <w:basedOn w:val="901"/>
     <w:uiPriority w:val="59"/>
     <w:pPr>
       <w:pBdr/>
@@ -11184,9 +11359,9 @@
       </w:tcPr>
     </w:tblStylePr>
   </w:style>
-  <w:style w:type="table" w:styleId="44">
+  <w:style w:type="table" w:styleId="754">
     <w:name w:val="Grid Table 4 - Accent 4"/>
-    <w:basedOn w:val="733"/>
+    <w:basedOn w:val="901"/>
     <w:uiPriority w:val="59"/>
     <w:pPr>
       <w:pBdr/>
@@ -11417,9 +11592,9 @@
       </w:tcPr>
     </w:tblStylePr>
   </w:style>
-  <w:style w:type="table" w:styleId="45">
+  <w:style w:type="table" w:styleId="755">
     <w:name w:val="Grid Table 4 - Accent 5"/>
-    <w:basedOn w:val="733"/>
+    <w:basedOn w:val="901"/>
     <w:uiPriority w:val="59"/>
     <w:pPr>
       <w:pBdr/>
@@ -11650,9 +11825,9 @@
       </w:tcPr>
     </w:tblStylePr>
   </w:style>
-  <w:style w:type="table" w:styleId="46">
+  <w:style w:type="table" w:styleId="756">
     <w:name w:val="Grid Table 4 - Accent 6"/>
-    <w:basedOn w:val="733"/>
+    <w:basedOn w:val="901"/>
     <w:uiPriority w:val="59"/>
     <w:pPr>
       <w:pBdr/>
@@ -11883,9 +12058,9 @@
       </w:tcPr>
     </w:tblStylePr>
   </w:style>
-  <w:style w:type="table" w:styleId="47">
+  <w:style w:type="table" w:styleId="757">
     <w:name w:val="Grid Table 5 Dark"/>
-    <w:basedOn w:val="733"/>
+    <w:basedOn w:val="901"/>
     <w:uiPriority w:val="99"/>
     <w:pPr>
       <w:pBdr/>
@@ -12111,9 +12286,9 @@
       </w:tcPr>
     </w:tblStylePr>
   </w:style>
-  <w:style w:type="table" w:styleId="48">
+  <w:style w:type="table" w:styleId="758">
     <w:name w:val="Grid Table 5 Dark- Accent 1"/>
-    <w:basedOn w:val="733"/>
+    <w:basedOn w:val="901"/>
     <w:uiPriority w:val="99"/>
     <w:pPr>
       <w:pBdr/>
@@ -12339,9 +12514,9 @@
       </w:tcPr>
     </w:tblStylePr>
   </w:style>
-  <w:style w:type="table" w:styleId="49">
+  <w:style w:type="table" w:styleId="759">
     <w:name w:val="Grid Table 5 Dark - Accent 2"/>
-    <w:basedOn w:val="733"/>
+    <w:basedOn w:val="901"/>
     <w:uiPriority w:val="99"/>
     <w:pPr>
       <w:pBdr/>
@@ -12567,9 +12742,9 @@
       </w:tcPr>
     </w:tblStylePr>
   </w:style>
-  <w:style w:type="table" w:styleId="50">
+  <w:style w:type="table" w:styleId="760">
     <w:name w:val="Grid Table 5 Dark - Accent 3"/>
-    <w:basedOn w:val="733"/>
+    <w:basedOn w:val="901"/>
     <w:uiPriority w:val="99"/>
     <w:pPr>
       <w:pBdr/>
@@ -12795,9 +12970,9 @@
       </w:tcPr>
     </w:tblStylePr>
   </w:style>
-  <w:style w:type="table" w:styleId="51">
+  <w:style w:type="table" w:styleId="761">
     <w:name w:val="Grid Table 5 Dark- Accent 4"/>
-    <w:basedOn w:val="733"/>
+    <w:basedOn w:val="901"/>
     <w:uiPriority w:val="99"/>
     <w:pPr>
       <w:pBdr/>
@@ -13023,9 +13198,9 @@
       </w:tcPr>
     </w:tblStylePr>
   </w:style>
-  <w:style w:type="table" w:styleId="52">
+  <w:style w:type="table" w:styleId="762">
     <w:name w:val="Grid Table 5 Dark - Accent 5"/>
-    <w:basedOn w:val="733"/>
+    <w:basedOn w:val="901"/>
     <w:uiPriority w:val="99"/>
     <w:pPr>
       <w:pBdr/>
@@ -13251,9 +13426,9 @@
       </w:tcPr>
     </w:tblStylePr>
   </w:style>
-  <w:style w:type="table" w:styleId="53">
+  <w:style w:type="table" w:styleId="763">
     <w:name w:val="Grid Table 5 Dark - Accent 6"/>
-    <w:basedOn w:val="733"/>
+    <w:basedOn w:val="901"/>
     <w:uiPriority w:val="99"/>
     <w:pPr>
       <w:pBdr/>
@@ -13479,9 +13654,9 @@
       </w:tcPr>
     </w:tblStylePr>
   </w:style>
-  <w:style w:type="table" w:styleId="54">
+  <w:style w:type="table" w:styleId="764">
     <w:name w:val="Grid Table 6 Colorful"/>
-    <w:basedOn w:val="733"/>
+    <w:basedOn w:val="901"/>
     <w:uiPriority w:val="99"/>
     <w:pPr>
       <w:pBdr/>
@@ -13709,9 +13884,9 @@
       </w:tcPr>
     </w:tblStylePr>
   </w:style>
-  <w:style w:type="table" w:styleId="55">
+  <w:style w:type="table" w:styleId="765">
     <w:name w:val="Grid Table 6 Colorful - Accent 1"/>
-    <w:basedOn w:val="733"/>
+    <w:basedOn w:val="901"/>
     <w:uiPriority w:val="99"/>
     <w:pPr>
       <w:pBdr/>
@@ -13939,9 +14114,9 @@
       </w:tcPr>
     </w:tblStylePr>
   </w:style>
-  <w:style w:type="table" w:styleId="56">
+  <w:style w:type="table" w:styleId="766">
     <w:name w:val="Grid Table 6 Colorful - Accent 2"/>
-    <w:basedOn w:val="733"/>
+    <w:basedOn w:val="901"/>
     <w:uiPriority w:val="99"/>
     <w:pPr>
       <w:pBdr/>
@@ -14169,9 +14344,9 @@
       </w:tcPr>
     </w:tblStylePr>
   </w:style>
-  <w:style w:type="table" w:styleId="57">
+  <w:style w:type="table" w:styleId="767">
     <w:name w:val="Grid Table 6 Colorful - Accent 3"/>
-    <w:basedOn w:val="733"/>
+    <w:basedOn w:val="901"/>
     <w:uiPriority w:val="99"/>
     <w:pPr>
       <w:pBdr/>
@@ -14399,9 +14574,9 @@
       </w:tcPr>
     </w:tblStylePr>
   </w:style>
-  <w:style w:type="table" w:styleId="58">
+  <w:style w:type="table" w:styleId="768">
     <w:name w:val="Grid Table 6 Colorful - Accent 4"/>
-    <w:basedOn w:val="733"/>
+    <w:basedOn w:val="901"/>
     <w:uiPriority w:val="99"/>
     <w:pPr>
       <w:pBdr/>
@@ -14629,9 +14804,9 @@
       </w:tcPr>
     </w:tblStylePr>
   </w:style>
-  <w:style w:type="table" w:styleId="59">
+  <w:style w:type="table" w:styleId="769">
     <w:name w:val="Grid Table 6 Colorful - Accent 5"/>
-    <w:basedOn w:val="733"/>
+    <w:basedOn w:val="901"/>
     <w:uiPriority w:val="99"/>
     <w:pPr>
       <w:pBdr/>
@@ -14859,9 +15034,9 @@
       </w:tcPr>
     </w:tblStylePr>
   </w:style>
-  <w:style w:type="table" w:styleId="60">
+  <w:style w:type="table" w:styleId="770">
     <w:name w:val="Grid Table 6 Colorful - Accent 6"/>
-    <w:basedOn w:val="733"/>
+    <w:basedOn w:val="901"/>
     <w:uiPriority w:val="99"/>
     <w:pPr>
       <w:pBdr/>
@@ -15089,9 +15264,9 @@
       </w:tcPr>
     </w:tblStylePr>
   </w:style>
-  <w:style w:type="table" w:styleId="61">
+  <w:style w:type="table" w:styleId="771">
     <w:name w:val="Grid Table 7 Colorful"/>
-    <w:basedOn w:val="733"/>
+    <w:basedOn w:val="901"/>
     <w:uiPriority w:val="99"/>
     <w:pPr>
       <w:pBdr/>
@@ -15193,11 +15368,11 @@
         <w:tblBorders/>
       </w:tblPr>
       <w:tcPr>
-        <w:shd w:color="ffffff"/>
+        <w:shd w:val="clear" w:color="ffffff"/>
         <w:tcBorders>
-          <w:top w:val="none"/>
-          <w:left w:val="none"/>
-          <w:bottom w:val="none"/>
+          <w:top w:val="none" w:color="000000" w:sz="4" w:space="0"/>
+          <w:left w:val="none" w:color="000000" w:sz="4" w:space="0"/>
+          <w:bottom w:val="none" w:color="000000" w:sz="4" w:space="0"/>
           <w:right w:val="single" w:color="000000" w:themeColor="text1" w:themeTint="80" w:sz="4" w:space="0"/>
         </w:tcBorders>
       </w:tcPr>
@@ -15220,10 +15395,10 @@
       <w:tcPr>
         <w:shd w:val="clear" w:color="ffffff" w:themeColor="light1" w:fill="ffffff" w:themeFill="light1"/>
         <w:tcBorders>
-          <w:top w:val="none"/>
-          <w:left w:val="none"/>
+          <w:top w:val="none" w:color="000000" w:sz="4" w:space="0"/>
+          <w:left w:val="none" w:color="000000" w:sz="4" w:space="0"/>
           <w:bottom w:val="single" w:color="000000" w:themeColor="text1" w:themeTint="80" w:sz="4" w:space="0"/>
-          <w:right w:val="none"/>
+          <w:right w:val="none" w:color="000000" w:sz="4" w:space="0"/>
         </w:tcBorders>
       </w:tcPr>
     </w:tblStylePr>
@@ -15243,12 +15418,12 @@
         <w:tblBorders/>
       </w:tblPr>
       <w:tcPr>
-        <w:shd w:color="ffffff"/>
+        <w:shd w:val="clear" w:color="ffffff"/>
         <w:tcBorders>
-          <w:top w:val="none"/>
+          <w:top w:val="none" w:color="000000" w:sz="4" w:space="0"/>
           <w:left w:val="single" w:color="000000" w:themeColor="text1" w:themeTint="80" w:sz="4" w:space="0"/>
-          <w:bottom w:val="none"/>
-          <w:right w:val="none"/>
+          <w:bottom w:val="none" w:color="000000" w:sz="4" w:space="0"/>
+          <w:right w:val="none" w:color="000000" w:sz="4" w:space="0"/>
         </w:tcBorders>
       </w:tcPr>
     </w:tblStylePr>
@@ -15271,9 +15446,9 @@
         <w:shd w:val="clear" w:color="ffffff" w:themeColor="light1" w:fill="ffffff" w:themeFill="light1"/>
         <w:tcBorders>
           <w:top w:val="single" w:color="000000" w:themeColor="text1" w:themeTint="80" w:sz="4" w:space="0"/>
-          <w:left w:val="none"/>
-          <w:bottom w:val="none"/>
-          <w:right w:val="none"/>
+          <w:left w:val="none" w:color="000000" w:sz="4" w:space="0"/>
+          <w:bottom w:val="none" w:color="000000" w:sz="4" w:space="0"/>
+          <w:right w:val="none" w:color="000000" w:sz="4" w:space="0"/>
         </w:tcBorders>
       </w:tcPr>
     </w:tblStylePr>
@@ -15343,9 +15518,9 @@
       </w:tcPr>
     </w:tblStylePr>
   </w:style>
-  <w:style w:type="table" w:styleId="62">
+  <w:style w:type="table" w:styleId="772">
     <w:name w:val="Grid Table 7 Colorful - Accent 1"/>
-    <w:basedOn w:val="733"/>
+    <w:basedOn w:val="901"/>
     <w:uiPriority w:val="99"/>
     <w:pPr>
       <w:pBdr/>
@@ -15447,11 +15622,11 @@
         <w:tblBorders/>
       </w:tblPr>
       <w:tcPr>
-        <w:shd w:color="ffffff"/>
+        <w:shd w:val="clear" w:color="ffffff"/>
         <w:tcBorders>
-          <w:top w:val="none"/>
-          <w:left w:val="none"/>
-          <w:bottom w:val="none"/>
+          <w:top w:val="none" w:color="000000" w:sz="4" w:space="0"/>
+          <w:left w:val="none" w:color="000000" w:sz="4" w:space="0"/>
+          <w:bottom w:val="none" w:color="000000" w:sz="4" w:space="0"/>
           <w:right w:val="single" w:color="000000" w:themeColor="accent1" w:themeTint="80" w:sz="4" w:space="0"/>
         </w:tcBorders>
       </w:tcPr>
@@ -15474,10 +15649,10 @@
       <w:tcPr>
         <w:shd w:val="clear" w:color="ffffff" w:themeColor="light1" w:fill="ffffff" w:themeFill="light1"/>
         <w:tcBorders>
-          <w:top w:val="none"/>
-          <w:left w:val="none"/>
+          <w:top w:val="none" w:color="000000" w:sz="4" w:space="0"/>
+          <w:left w:val="none" w:color="000000" w:sz="4" w:space="0"/>
           <w:bottom w:val="single" w:color="000000" w:themeColor="accent1" w:themeTint="80" w:sz="4" w:space="0"/>
-          <w:right w:val="none"/>
+          <w:right w:val="none" w:color="000000" w:sz="4" w:space="0"/>
         </w:tcBorders>
       </w:tcPr>
     </w:tblStylePr>
@@ -15497,12 +15672,12 @@
         <w:tblBorders/>
       </w:tblPr>
       <w:tcPr>
-        <w:shd w:color="ffffff"/>
+        <w:shd w:val="clear" w:color="ffffff"/>
         <w:tcBorders>
-          <w:top w:val="none"/>
+          <w:top w:val="none" w:color="000000" w:sz="4" w:space="0"/>
           <w:left w:val="single" w:color="000000" w:themeColor="accent1" w:themeTint="80" w:sz="4" w:space="0"/>
-          <w:bottom w:val="none"/>
-          <w:right w:val="none"/>
+          <w:bottom w:val="none" w:color="000000" w:sz="4" w:space="0"/>
+          <w:right w:val="none" w:color="000000" w:sz="4" w:space="0"/>
         </w:tcBorders>
       </w:tcPr>
     </w:tblStylePr>
@@ -15525,9 +15700,9 @@
         <w:shd w:val="clear" w:color="ffffff" w:themeColor="light1" w:fill="ffffff" w:themeFill="light1"/>
         <w:tcBorders>
           <w:top w:val="single" w:color="000000" w:themeColor="accent1" w:themeTint="80" w:sz="4" w:space="0"/>
-          <w:left w:val="none"/>
-          <w:bottom w:val="none"/>
-          <w:right w:val="none"/>
+          <w:left w:val="none" w:color="000000" w:sz="4" w:space="0"/>
+          <w:bottom w:val="none" w:color="000000" w:sz="4" w:space="0"/>
+          <w:right w:val="none" w:color="000000" w:sz="4" w:space="0"/>
         </w:tcBorders>
       </w:tcPr>
     </w:tblStylePr>
@@ -15597,9 +15772,9 @@
       </w:tcPr>
     </w:tblStylePr>
   </w:style>
-  <w:style w:type="table" w:styleId="63">
+  <w:style w:type="table" w:styleId="773">
     <w:name w:val="Grid Table 7 Colorful - Accent 2"/>
-    <w:basedOn w:val="733"/>
+    <w:basedOn w:val="901"/>
     <w:uiPriority w:val="99"/>
     <w:pPr>
       <w:pBdr/>
@@ -15701,11 +15876,11 @@
         <w:tblBorders/>
       </w:tblPr>
       <w:tcPr>
-        <w:shd w:color="ffffff"/>
+        <w:shd w:val="clear" w:color="ffffff"/>
         <w:tcBorders>
-          <w:top w:val="none"/>
-          <w:left w:val="none"/>
-          <w:bottom w:val="none"/>
+          <w:top w:val="none" w:color="000000" w:sz="4" w:space="0"/>
+          <w:left w:val="none" w:color="000000" w:sz="4" w:space="0"/>
+          <w:bottom w:val="none" w:color="000000" w:sz="4" w:space="0"/>
           <w:right w:val="single" w:color="000000" w:themeColor="accent2" w:themeTint="97" w:sz="4" w:space="0"/>
         </w:tcBorders>
       </w:tcPr>
@@ -15728,10 +15903,10 @@
       <w:tcPr>
         <w:shd w:val="clear" w:color="ffffff" w:themeColor="light1" w:fill="ffffff" w:themeFill="light1"/>
         <w:tcBorders>
-          <w:top w:val="none"/>
-          <w:left w:val="none"/>
+          <w:top w:val="none" w:color="000000" w:sz="4" w:space="0"/>
+          <w:left w:val="none" w:color="000000" w:sz="4" w:space="0"/>
           <w:bottom w:val="single" w:color="000000" w:themeColor="accent2" w:themeTint="97" w:sz="4" w:space="0"/>
-          <w:right w:val="none"/>
+          <w:right w:val="none" w:color="000000" w:sz="4" w:space="0"/>
         </w:tcBorders>
       </w:tcPr>
     </w:tblStylePr>
@@ -15751,12 +15926,12 @@
         <w:tblBorders/>
       </w:tblPr>
       <w:tcPr>
-        <w:shd w:color="ffffff"/>
+        <w:shd w:val="clear" w:color="ffffff"/>
         <w:tcBorders>
-          <w:top w:val="none"/>
+          <w:top w:val="none" w:color="000000" w:sz="4" w:space="0"/>
           <w:left w:val="single" w:color="000000" w:themeColor="accent2" w:themeTint="97" w:sz="4" w:space="0"/>
-          <w:bottom w:val="none"/>
-          <w:right w:val="none"/>
+          <w:bottom w:val="none" w:color="000000" w:sz="4" w:space="0"/>
+          <w:right w:val="none" w:color="000000" w:sz="4" w:space="0"/>
         </w:tcBorders>
       </w:tcPr>
     </w:tblStylePr>
@@ -15779,9 +15954,9 @@
         <w:shd w:val="clear" w:color="ffffff" w:themeColor="light1" w:fill="ffffff" w:themeFill="light1"/>
         <w:tcBorders>
           <w:top w:val="single" w:color="000000" w:themeColor="accent2" w:themeTint="97" w:sz="4" w:space="0"/>
-          <w:left w:val="none"/>
-          <w:bottom w:val="none"/>
-          <w:right w:val="none"/>
+          <w:left w:val="none" w:color="000000" w:sz="4" w:space="0"/>
+          <w:bottom w:val="none" w:color="000000" w:sz="4" w:space="0"/>
+          <w:right w:val="none" w:color="000000" w:sz="4" w:space="0"/>
         </w:tcBorders>
       </w:tcPr>
     </w:tblStylePr>
@@ -15851,9 +16026,9 @@
       </w:tcPr>
     </w:tblStylePr>
   </w:style>
-  <w:style w:type="table" w:styleId="64">
+  <w:style w:type="table" w:styleId="774">
     <w:name w:val="Grid Table 7 Colorful - Accent 3"/>
-    <w:basedOn w:val="733"/>
+    <w:basedOn w:val="901"/>
     <w:uiPriority w:val="99"/>
     <w:pPr>
       <w:pBdr/>
@@ -15955,11 +16130,11 @@
         <w:tblBorders/>
       </w:tblPr>
       <w:tcPr>
-        <w:shd w:color="ffffff"/>
+        <w:shd w:val="clear" w:color="ffffff"/>
         <w:tcBorders>
-          <w:top w:val="none"/>
-          <w:left w:val="none"/>
-          <w:bottom w:val="none"/>
+          <w:top w:val="none" w:color="000000" w:sz="4" w:space="0"/>
+          <w:left w:val="none" w:color="000000" w:sz="4" w:space="0"/>
+          <w:bottom w:val="none" w:color="000000" w:sz="4" w:space="0"/>
           <w:right w:val="single" w:color="000000" w:themeColor="accent3" w:themeTint="FE" w:sz="4" w:space="0"/>
         </w:tcBorders>
       </w:tcPr>
@@ -15982,10 +16157,10 @@
       <w:tcPr>
         <w:shd w:val="clear" w:color="ffffff" w:themeColor="light1" w:fill="ffffff" w:themeFill="light1"/>
         <w:tcBorders>
-          <w:top w:val="none"/>
-          <w:left w:val="none"/>
+          <w:top w:val="none" w:color="000000" w:sz="4" w:space="0"/>
+          <w:left w:val="none" w:color="000000" w:sz="4" w:space="0"/>
           <w:bottom w:val="single" w:color="000000" w:themeColor="accent3" w:themeTint="FE" w:sz="4" w:space="0"/>
-          <w:right w:val="none"/>
+          <w:right w:val="none" w:color="000000" w:sz="4" w:space="0"/>
         </w:tcBorders>
       </w:tcPr>
     </w:tblStylePr>
@@ -16005,12 +16180,12 @@
         <w:tblBorders/>
       </w:tblPr>
       <w:tcPr>
-        <w:shd w:color="ffffff"/>
+        <w:shd w:val="clear" w:color="ffffff"/>
         <w:tcBorders>
-          <w:top w:val="none"/>
+          <w:top w:val="none" w:color="000000" w:sz="4" w:space="0"/>
           <w:left w:val="single" w:color="000000" w:themeColor="accent3" w:themeTint="FE" w:sz="4" w:space="0"/>
-          <w:bottom w:val="none"/>
-          <w:right w:val="none"/>
+          <w:bottom w:val="none" w:color="000000" w:sz="4" w:space="0"/>
+          <w:right w:val="none" w:color="000000" w:sz="4" w:space="0"/>
         </w:tcBorders>
       </w:tcPr>
     </w:tblStylePr>
@@ -16033,9 +16208,9 @@
         <w:shd w:val="clear" w:color="ffffff" w:themeColor="light1" w:fill="ffffff" w:themeFill="light1"/>
         <w:tcBorders>
           <w:top w:val="single" w:color="000000" w:themeColor="accent3" w:themeTint="FE" w:sz="4" w:space="0"/>
-          <w:left w:val="none"/>
-          <w:bottom w:val="none"/>
-          <w:right w:val="none"/>
+          <w:left w:val="none" w:color="000000" w:sz="4" w:space="0"/>
+          <w:bottom w:val="none" w:color="000000" w:sz="4" w:space="0"/>
+          <w:right w:val="none" w:color="000000" w:sz="4" w:space="0"/>
         </w:tcBorders>
       </w:tcPr>
     </w:tblStylePr>
@@ -16105,9 +16280,9 @@
       </w:tcPr>
     </w:tblStylePr>
   </w:style>
-  <w:style w:type="table" w:styleId="65">
+  <w:style w:type="table" w:styleId="775">
     <w:name w:val="Grid Table 7 Colorful - Accent 4"/>
-    <w:basedOn w:val="733"/>
+    <w:basedOn w:val="901"/>
     <w:uiPriority w:val="99"/>
     <w:pPr>
       <w:pBdr/>
@@ -16209,11 +16384,11 @@
         <w:tblBorders/>
       </w:tblPr>
       <w:tcPr>
-        <w:shd w:color="ffffff"/>
+        <w:shd w:val="clear" w:color="ffffff"/>
         <w:tcBorders>
-          <w:top w:val="none"/>
-          <w:left w:val="none"/>
-          <w:bottom w:val="none"/>
+          <w:top w:val="none" w:color="000000" w:sz="4" w:space="0"/>
+          <w:left w:val="none" w:color="000000" w:sz="4" w:space="0"/>
+          <w:bottom w:val="none" w:color="000000" w:sz="4" w:space="0"/>
           <w:right w:val="single" w:color="000000" w:themeColor="accent4" w:themeTint="9A" w:sz="4" w:space="0"/>
         </w:tcBorders>
       </w:tcPr>
@@ -16236,10 +16411,10 @@
       <w:tcPr>
         <w:shd w:val="clear" w:color="ffffff" w:themeColor="light1" w:fill="ffffff" w:themeFill="light1"/>
         <w:tcBorders>
-          <w:top w:val="none"/>
-          <w:left w:val="none"/>
+          <w:top w:val="none" w:color="000000" w:sz="4" w:space="0"/>
+          <w:left w:val="none" w:color="000000" w:sz="4" w:space="0"/>
           <w:bottom w:val="single" w:color="000000" w:themeColor="accent4" w:themeTint="9A" w:sz="4" w:space="0"/>
-          <w:right w:val="none"/>
+          <w:right w:val="none" w:color="000000" w:sz="4" w:space="0"/>
         </w:tcBorders>
       </w:tcPr>
     </w:tblStylePr>
@@ -16259,12 +16434,12 @@
         <w:tblBorders/>
       </w:tblPr>
       <w:tcPr>
-        <w:shd w:color="ffffff"/>
+        <w:shd w:val="clear" w:color="ffffff"/>
         <w:tcBorders>
-          <w:top w:val="none"/>
+          <w:top w:val="none" w:color="000000" w:sz="4" w:space="0"/>
           <w:left w:val="single" w:color="000000" w:themeColor="accent4" w:themeTint="9A" w:sz="4" w:space="0"/>
-          <w:bottom w:val="none"/>
-          <w:right w:val="none"/>
+          <w:bottom w:val="none" w:color="000000" w:sz="4" w:space="0"/>
+          <w:right w:val="none" w:color="000000" w:sz="4" w:space="0"/>
         </w:tcBorders>
       </w:tcPr>
     </w:tblStylePr>
@@ -16287,9 +16462,9 @@
         <w:shd w:val="clear" w:color="ffffff" w:themeColor="light1" w:fill="ffffff" w:themeFill="light1"/>
         <w:tcBorders>
           <w:top w:val="single" w:color="000000" w:themeColor="accent4" w:themeTint="9A" w:sz="4" w:space="0"/>
-          <w:left w:val="none"/>
-          <w:bottom w:val="none"/>
-          <w:right w:val="none"/>
+          <w:left w:val="none" w:color="000000" w:sz="4" w:space="0"/>
+          <w:bottom w:val="none" w:color="000000" w:sz="4" w:space="0"/>
+          <w:right w:val="none" w:color="000000" w:sz="4" w:space="0"/>
         </w:tcBorders>
       </w:tcPr>
     </w:tblStylePr>
@@ -16359,9 +16534,9 @@
       </w:tcPr>
     </w:tblStylePr>
   </w:style>
-  <w:style w:type="table" w:styleId="66">
+  <w:style w:type="table" w:styleId="776">
     <w:name w:val="Grid Table 7 Colorful - Accent 5"/>
-    <w:basedOn w:val="733"/>
+    <w:basedOn w:val="901"/>
     <w:uiPriority w:val="99"/>
     <w:pPr>
       <w:pBdr/>
@@ -16463,11 +16638,11 @@
         <w:tblBorders/>
       </w:tblPr>
       <w:tcPr>
-        <w:shd w:color="ffffff"/>
+        <w:shd w:val="clear" w:color="ffffff"/>
         <w:tcBorders>
-          <w:top w:val="none"/>
-          <w:left w:val="none"/>
-          <w:bottom w:val="none"/>
+          <w:top w:val="none" w:color="000000" w:sz="4" w:space="0"/>
+          <w:left w:val="none" w:color="000000" w:sz="4" w:space="0"/>
+          <w:bottom w:val="none" w:color="000000" w:sz="4" w:space="0"/>
           <w:right w:val="single" w:color="000000" w:themeColor="accent5" w:themeTint="90" w:sz="4" w:space="0"/>
         </w:tcBorders>
       </w:tcPr>
@@ -16490,10 +16665,10 @@
       <w:tcPr>
         <w:shd w:val="clear" w:color="ffffff" w:themeColor="light1" w:fill="ffffff" w:themeFill="light1"/>
         <w:tcBorders>
-          <w:top w:val="none"/>
-          <w:left w:val="none"/>
+          <w:top w:val="none" w:color="000000" w:sz="4" w:space="0"/>
+          <w:left w:val="none" w:color="000000" w:sz="4" w:space="0"/>
           <w:bottom w:val="single" w:color="000000" w:themeColor="accent5" w:themeTint="90" w:sz="4" w:space="0"/>
-          <w:right w:val="none"/>
+          <w:right w:val="none" w:color="000000" w:sz="4" w:space="0"/>
         </w:tcBorders>
       </w:tcPr>
     </w:tblStylePr>
@@ -16513,12 +16688,12 @@
         <w:tblBorders/>
       </w:tblPr>
       <w:tcPr>
-        <w:shd w:color="ffffff"/>
+        <w:shd w:val="clear" w:color="ffffff"/>
         <w:tcBorders>
-          <w:top w:val="none"/>
+          <w:top w:val="none" w:color="000000" w:sz="4" w:space="0"/>
           <w:left w:val="single" w:color="000000" w:themeColor="accent5" w:themeTint="90" w:sz="4" w:space="0"/>
-          <w:bottom w:val="none"/>
-          <w:right w:val="none"/>
+          <w:bottom w:val="none" w:color="000000" w:sz="4" w:space="0"/>
+          <w:right w:val="none" w:color="000000" w:sz="4" w:space="0"/>
         </w:tcBorders>
       </w:tcPr>
     </w:tblStylePr>
@@ -16541,9 +16716,9 @@
         <w:shd w:val="clear" w:color="ffffff" w:themeColor="light1" w:fill="ffffff" w:themeFill="light1"/>
         <w:tcBorders>
           <w:top w:val="single" w:color="000000" w:themeColor="accent5" w:themeTint="90" w:sz="4" w:space="0"/>
-          <w:left w:val="none"/>
-          <w:bottom w:val="none"/>
-          <w:right w:val="none"/>
+          <w:left w:val="none" w:color="000000" w:sz="4" w:space="0"/>
+          <w:bottom w:val="none" w:color="000000" w:sz="4" w:space="0"/>
+          <w:right w:val="none" w:color="000000" w:sz="4" w:space="0"/>
         </w:tcBorders>
       </w:tcPr>
     </w:tblStylePr>
@@ -16613,9 +16788,9 @@
       </w:tcPr>
     </w:tblStylePr>
   </w:style>
-  <w:style w:type="table" w:styleId="67">
+  <w:style w:type="table" w:styleId="777">
     <w:name w:val="Grid Table 7 Colorful - Accent 6"/>
-    <w:basedOn w:val="733"/>
+    <w:basedOn w:val="901"/>
     <w:uiPriority w:val="99"/>
     <w:pPr>
       <w:pBdr/>
@@ -16717,11 +16892,11 @@
         <w:tblBorders/>
       </w:tblPr>
       <w:tcPr>
-        <w:shd w:color="ffffff"/>
+        <w:shd w:val="clear" w:color="ffffff"/>
         <w:tcBorders>
-          <w:top w:val="none"/>
-          <w:left w:val="none"/>
-          <w:bottom w:val="none"/>
+          <w:top w:val="none" w:color="000000" w:sz="4" w:space="0"/>
+          <w:left w:val="none" w:color="000000" w:sz="4" w:space="0"/>
+          <w:bottom w:val="none" w:color="000000" w:sz="4" w:space="0"/>
           <w:right w:val="single" w:color="000000" w:themeColor="accent6" w:themeTint="90" w:sz="4" w:space="0"/>
         </w:tcBorders>
       </w:tcPr>
@@ -16744,10 +16919,10 @@
       <w:tcPr>
         <w:shd w:val="clear" w:color="ffffff" w:themeColor="light1" w:fill="ffffff" w:themeFill="light1"/>
         <w:tcBorders>
-          <w:top w:val="none"/>
-          <w:left w:val="none"/>
+          <w:top w:val="none" w:color="000000" w:sz="4" w:space="0"/>
+          <w:left w:val="none" w:color="000000" w:sz="4" w:space="0"/>
           <w:bottom w:val="single" w:color="000000" w:themeColor="accent6" w:themeTint="90" w:sz="4" w:space="0"/>
-          <w:right w:val="none"/>
+          <w:right w:val="none" w:color="000000" w:sz="4" w:space="0"/>
         </w:tcBorders>
       </w:tcPr>
     </w:tblStylePr>
@@ -16767,12 +16942,12 @@
         <w:tblBorders/>
       </w:tblPr>
       <w:tcPr>
-        <w:shd w:color="ffffff"/>
+        <w:shd w:val="clear" w:color="ffffff"/>
         <w:tcBorders>
-          <w:top w:val="none"/>
+          <w:top w:val="none" w:color="000000" w:sz="4" w:space="0"/>
           <w:left w:val="single" w:color="000000" w:themeColor="accent6" w:themeTint="90" w:sz="4" w:space="0"/>
-          <w:bottom w:val="none"/>
-          <w:right w:val="none"/>
+          <w:bottom w:val="none" w:color="000000" w:sz="4" w:space="0"/>
+          <w:right w:val="none" w:color="000000" w:sz="4" w:space="0"/>
         </w:tcBorders>
       </w:tcPr>
     </w:tblStylePr>
@@ -16795,9 +16970,9 @@
         <w:shd w:val="clear" w:color="ffffff" w:themeColor="light1" w:fill="ffffff" w:themeFill="light1"/>
         <w:tcBorders>
           <w:top w:val="single" w:color="000000" w:themeColor="accent6" w:themeTint="90" w:sz="4" w:space="0"/>
-          <w:left w:val="none"/>
-          <w:bottom w:val="none"/>
-          <w:right w:val="none"/>
+          <w:left w:val="none" w:color="000000" w:sz="4" w:space="0"/>
+          <w:bottom w:val="none" w:color="000000" w:sz="4" w:space="0"/>
+          <w:right w:val="none" w:color="000000" w:sz="4" w:space="0"/>
         </w:tcBorders>
       </w:tcPr>
     </w:tblStylePr>
@@ -16867,9 +17042,9 @@
       </w:tcPr>
     </w:tblStylePr>
   </w:style>
-  <w:style w:type="table" w:styleId="68">
+  <w:style w:type="table" w:styleId="778">
     <w:name w:val="List Table 1 Light"/>
-    <w:basedOn w:val="733"/>
+    <w:basedOn w:val="901"/>
     <w:uiPriority w:val="99"/>
     <w:pPr>
       <w:pBdr/>
@@ -17083,9 +17258,9 @@
       </w:tcPr>
     </w:tblStylePr>
   </w:style>
-  <w:style w:type="table" w:styleId="69">
+  <w:style w:type="table" w:styleId="779">
     <w:name w:val="List Table 1 Light - Accent 1"/>
-    <w:basedOn w:val="733"/>
+    <w:basedOn w:val="901"/>
     <w:uiPriority w:val="99"/>
     <w:pPr>
       <w:pBdr/>
@@ -17299,9 +17474,9 @@
       </w:tcPr>
     </w:tblStylePr>
   </w:style>
-  <w:style w:type="table" w:styleId="70">
+  <w:style w:type="table" w:styleId="780">
     <w:name w:val="List Table 1 Light - Accent 2"/>
-    <w:basedOn w:val="733"/>
+    <w:basedOn w:val="901"/>
     <w:uiPriority w:val="99"/>
     <w:pPr>
       <w:pBdr/>
@@ -17515,9 +17690,9 @@
       </w:tcPr>
     </w:tblStylePr>
   </w:style>
-  <w:style w:type="table" w:styleId="71">
+  <w:style w:type="table" w:styleId="781">
     <w:name w:val="List Table 1 Light - Accent 3"/>
-    <w:basedOn w:val="733"/>
+    <w:basedOn w:val="901"/>
     <w:uiPriority w:val="99"/>
     <w:pPr>
       <w:pBdr/>
@@ -17731,9 +17906,9 @@
       </w:tcPr>
     </w:tblStylePr>
   </w:style>
-  <w:style w:type="table" w:styleId="72">
+  <w:style w:type="table" w:styleId="782">
     <w:name w:val="List Table 1 Light - Accent 4"/>
-    <w:basedOn w:val="733"/>
+    <w:basedOn w:val="901"/>
     <w:uiPriority w:val="99"/>
     <w:pPr>
       <w:pBdr/>
@@ -17947,9 +18122,9 @@
       </w:tcPr>
     </w:tblStylePr>
   </w:style>
-  <w:style w:type="table" w:styleId="73">
+  <w:style w:type="table" w:styleId="783">
     <w:name w:val="List Table 1 Light - Accent 5"/>
-    <w:basedOn w:val="733"/>
+    <w:basedOn w:val="901"/>
     <w:uiPriority w:val="99"/>
     <w:pPr>
       <w:pBdr/>
@@ -18163,9 +18338,9 @@
       </w:tcPr>
     </w:tblStylePr>
   </w:style>
-  <w:style w:type="table" w:styleId="74">
+  <w:style w:type="table" w:styleId="784">
     <w:name w:val="List Table 1 Light - Accent 6"/>
-    <w:basedOn w:val="733"/>
+    <w:basedOn w:val="901"/>
     <w:uiPriority w:val="99"/>
     <w:pPr>
       <w:pBdr/>
@@ -18379,9 +18554,9 @@
       </w:tcPr>
     </w:tblStylePr>
   </w:style>
-  <w:style w:type="table" w:styleId="75">
+  <w:style w:type="table" w:styleId="785">
     <w:name w:val="List Table 2"/>
-    <w:basedOn w:val="733"/>
+    <w:basedOn w:val="901"/>
     <w:uiPriority w:val="99"/>
     <w:pPr>
       <w:pBdr/>
@@ -18617,9 +18792,9 @@
       </w:tcPr>
     </w:tblStylePr>
   </w:style>
-  <w:style w:type="table" w:styleId="76">
+  <w:style w:type="table" w:styleId="786">
     <w:name w:val="List Table 2 - Accent 1"/>
-    <w:basedOn w:val="733"/>
+    <w:basedOn w:val="901"/>
     <w:uiPriority w:val="99"/>
     <w:pPr>
       <w:pBdr/>
@@ -18855,9 +19030,9 @@
       </w:tcPr>
     </w:tblStylePr>
   </w:style>
-  <w:style w:type="table" w:styleId="77">
+  <w:style w:type="table" w:styleId="787">
     <w:name w:val="List Table 2 - Accent 2"/>
-    <w:basedOn w:val="733"/>
+    <w:basedOn w:val="901"/>
     <w:uiPriority w:val="99"/>
     <w:pPr>
       <w:pBdr/>
@@ -19093,9 +19268,9 @@
       </w:tcPr>
     </w:tblStylePr>
   </w:style>
-  <w:style w:type="table" w:styleId="78">
+  <w:style w:type="table" w:styleId="788">
     <w:name w:val="List Table 2 - Accent 3"/>
-    <w:basedOn w:val="733"/>
+    <w:basedOn w:val="901"/>
     <w:uiPriority w:val="99"/>
     <w:pPr>
       <w:pBdr/>
@@ -19331,9 +19506,9 @@
       </w:tcPr>
     </w:tblStylePr>
   </w:style>
-  <w:style w:type="table" w:styleId="79">
+  <w:style w:type="table" w:styleId="789">
     <w:name w:val="List Table 2 - Accent 4"/>
-    <w:basedOn w:val="733"/>
+    <w:basedOn w:val="901"/>
     <w:uiPriority w:val="99"/>
     <w:pPr>
       <w:pBdr/>
@@ -19569,9 +19744,9 @@
       </w:tcPr>
     </w:tblStylePr>
   </w:style>
-  <w:style w:type="table" w:styleId="80">
+  <w:style w:type="table" w:styleId="790">
     <w:name w:val="List Table 2 - Accent 5"/>
-    <w:basedOn w:val="733"/>
+    <w:basedOn w:val="901"/>
     <w:uiPriority w:val="99"/>
     <w:pPr>
       <w:pBdr/>
@@ -19807,9 +19982,9 @@
       </w:tcPr>
     </w:tblStylePr>
   </w:style>
-  <w:style w:type="table" w:styleId="81">
+  <w:style w:type="table" w:styleId="791">
     <w:name w:val="List Table 2 - Accent 6"/>
-    <w:basedOn w:val="733"/>
+    <w:basedOn w:val="901"/>
     <w:uiPriority w:val="99"/>
     <w:pPr>
       <w:pBdr/>
@@ -20045,9 +20220,9 @@
       </w:tcPr>
     </w:tblStylePr>
   </w:style>
-  <w:style w:type="table" w:styleId="82">
+  <w:style w:type="table" w:styleId="792">
     <w:name w:val="List Table 3"/>
-    <w:basedOn w:val="733"/>
+    <w:basedOn w:val="901"/>
     <w:uiPriority w:val="99"/>
     <w:pPr>
       <w:pBdr/>
@@ -20273,9 +20448,9 @@
       </w:tcPr>
     </w:tblStylePr>
   </w:style>
-  <w:style w:type="table" w:styleId="83">
+  <w:style w:type="table" w:styleId="793">
     <w:name w:val="List Table 3 - Accent 1"/>
-    <w:basedOn w:val="733"/>
+    <w:basedOn w:val="901"/>
     <w:uiPriority w:val="99"/>
     <w:pPr>
       <w:pBdr/>
@@ -20501,9 +20676,9 @@
       </w:tcPr>
     </w:tblStylePr>
   </w:style>
-  <w:style w:type="table" w:styleId="84">
+  <w:style w:type="table" w:styleId="794">
     <w:name w:val="List Table 3 - Accent 2"/>
-    <w:basedOn w:val="733"/>
+    <w:basedOn w:val="901"/>
     <w:uiPriority w:val="99"/>
     <w:pPr>
       <w:pBdr/>
@@ -20729,9 +20904,9 @@
       </w:tcPr>
     </w:tblStylePr>
   </w:style>
-  <w:style w:type="table" w:styleId="85">
+  <w:style w:type="table" w:styleId="795">
     <w:name w:val="List Table 3 - Accent 3"/>
-    <w:basedOn w:val="733"/>
+    <w:basedOn w:val="901"/>
     <w:uiPriority w:val="99"/>
     <w:pPr>
       <w:pBdr/>
@@ -20957,9 +21132,9 @@
       </w:tcPr>
     </w:tblStylePr>
   </w:style>
-  <w:style w:type="table" w:styleId="86">
+  <w:style w:type="table" w:styleId="796">
     <w:name w:val="List Table 3 - Accent 4"/>
-    <w:basedOn w:val="733"/>
+    <w:basedOn w:val="901"/>
     <w:uiPriority w:val="99"/>
     <w:pPr>
       <w:pBdr/>
@@ -21185,9 +21360,9 @@
       </w:tcPr>
     </w:tblStylePr>
   </w:style>
-  <w:style w:type="table" w:styleId="87">
+  <w:style w:type="table" w:styleId="797">
     <w:name w:val="List Table 3 - Accent 5"/>
-    <w:basedOn w:val="733"/>
+    <w:basedOn w:val="901"/>
     <w:uiPriority w:val="99"/>
     <w:pPr>
       <w:pBdr/>
@@ -21413,9 +21588,9 @@
       </w:tcPr>
     </w:tblStylePr>
   </w:style>
-  <w:style w:type="table" w:styleId="88">
+  <w:style w:type="table" w:styleId="798">
     <w:name w:val="List Table 3 - Accent 6"/>
-    <w:basedOn w:val="733"/>
+    <w:basedOn w:val="901"/>
     <w:uiPriority w:val="99"/>
     <w:pPr>
       <w:pBdr/>
@@ -21641,9 +21816,9 @@
       </w:tcPr>
     </w:tblStylePr>
   </w:style>
-  <w:style w:type="table" w:styleId="89">
+  <w:style w:type="table" w:styleId="799">
     <w:name w:val="List Table 4"/>
-    <w:basedOn w:val="733"/>
+    <w:basedOn w:val="901"/>
     <w:uiPriority w:val="99"/>
     <w:pPr>
       <w:pBdr/>
@@ -21866,9 +22041,9 @@
       </w:tcPr>
     </w:tblStylePr>
   </w:style>
-  <w:style w:type="table" w:styleId="90">
+  <w:style w:type="table" w:styleId="800">
     <w:name w:val="List Table 4 - Accent 1"/>
-    <w:basedOn w:val="733"/>
+    <w:basedOn w:val="901"/>
     <w:uiPriority w:val="99"/>
     <w:pPr>
       <w:pBdr/>
@@ -22091,9 +22266,9 @@
       </w:tcPr>
     </w:tblStylePr>
   </w:style>
-  <w:style w:type="table" w:styleId="91">
+  <w:style w:type="table" w:styleId="801">
     <w:name w:val="List Table 4 - Accent 2"/>
-    <w:basedOn w:val="733"/>
+    <w:basedOn w:val="901"/>
     <w:uiPriority w:val="99"/>
     <w:pPr>
       <w:pBdr/>
@@ -22316,9 +22491,9 @@
       </w:tcPr>
     </w:tblStylePr>
   </w:style>
-  <w:style w:type="table" w:styleId="92">
+  <w:style w:type="table" w:styleId="802">
     <w:name w:val="List Table 4 - Accent 3"/>
-    <w:basedOn w:val="733"/>
+    <w:basedOn w:val="901"/>
     <w:uiPriority w:val="99"/>
     <w:pPr>
       <w:pBdr/>
@@ -22541,9 +22716,9 @@
       </w:tcPr>
     </w:tblStylePr>
   </w:style>
-  <w:style w:type="table" w:styleId="93">
+  <w:style w:type="table" w:styleId="803">
     <w:name w:val="List Table 4 - Accent 4"/>
-    <w:basedOn w:val="733"/>
+    <w:basedOn w:val="901"/>
     <w:uiPriority w:val="99"/>
     <w:pPr>
       <w:pBdr/>
@@ -22766,9 +22941,9 @@
       </w:tcPr>
     </w:tblStylePr>
   </w:style>
-  <w:style w:type="table" w:styleId="94">
+  <w:style w:type="table" w:styleId="804">
     <w:name w:val="List Table 4 - Accent 5"/>
-    <w:basedOn w:val="733"/>
+    <w:basedOn w:val="901"/>
     <w:uiPriority w:val="99"/>
     <w:pPr>
       <w:pBdr/>
@@ -22991,9 +23166,9 @@
       </w:tcPr>
     </w:tblStylePr>
   </w:style>
-  <w:style w:type="table" w:styleId="95">
+  <w:style w:type="table" w:styleId="805">
     <w:name w:val="List Table 4 - Accent 6"/>
-    <w:basedOn w:val="733"/>
+    <w:basedOn w:val="901"/>
     <w:uiPriority w:val="99"/>
     <w:pPr>
       <w:pBdr/>
@@ -23216,9 +23391,9 @@
       </w:tcPr>
     </w:tblStylePr>
   </w:style>
-  <w:style w:type="table" w:styleId="96">
+  <w:style w:type="table" w:styleId="806">
     <w:name w:val="List Table 5 Dark"/>
-    <w:basedOn w:val="733"/>
+    <w:basedOn w:val="901"/>
     <w:uiPriority w:val="99"/>
     <w:pPr>
       <w:pBdr/>
@@ -23458,9 +23633,9 @@
       </w:tcPr>
     </w:tblStylePr>
   </w:style>
-  <w:style w:type="table" w:styleId="97">
+  <w:style w:type="table" w:styleId="807">
     <w:name w:val="List Table 5 Dark - Accent 1"/>
-    <w:basedOn w:val="733"/>
+    <w:basedOn w:val="901"/>
     <w:uiPriority w:val="99"/>
     <w:pPr>
       <w:pBdr/>
@@ -23700,9 +23875,9 @@
       </w:tcPr>
     </w:tblStylePr>
   </w:style>
-  <w:style w:type="table" w:styleId="98">
+  <w:style w:type="table" w:styleId="808">
     <w:name w:val="List Table 5 Dark - Accent 2"/>
-    <w:basedOn w:val="733"/>
+    <w:basedOn w:val="901"/>
     <w:uiPriority w:val="99"/>
     <w:pPr>
       <w:pBdr/>
@@ -23942,9 +24117,9 @@
       </w:tcPr>
     </w:tblStylePr>
   </w:style>
-  <w:style w:type="table" w:styleId="99">
+  <w:style w:type="table" w:styleId="809">
     <w:name w:val="List Table 5 Dark - Accent 3"/>
-    <w:basedOn w:val="733"/>
+    <w:basedOn w:val="901"/>
     <w:uiPriority w:val="99"/>
     <w:pPr>
       <w:pBdr/>
@@ -24184,9 +24359,9 @@
       </w:tcPr>
     </w:tblStylePr>
   </w:style>
-  <w:style w:type="table" w:styleId="100">
+  <w:style w:type="table" w:styleId="810">
     <w:name w:val="List Table 5 Dark - Accent 4"/>
-    <w:basedOn w:val="733"/>
+    <w:basedOn w:val="901"/>
     <w:uiPriority w:val="99"/>
     <w:pPr>
       <w:pBdr/>
@@ -24426,9 +24601,9 @@
       </w:tcPr>
     </w:tblStylePr>
   </w:style>
-  <w:style w:type="table" w:styleId="101">
+  <w:style w:type="table" w:styleId="811">
     <w:name w:val="List Table 5 Dark - Accent 5"/>
-    <w:basedOn w:val="733"/>
+    <w:basedOn w:val="901"/>
     <w:uiPriority w:val="99"/>
     <w:pPr>
       <w:pBdr/>
@@ -24668,9 +24843,9 @@
       </w:tcPr>
     </w:tblStylePr>
   </w:style>
-  <w:style w:type="table" w:styleId="102">
+  <w:style w:type="table" w:styleId="812">
     <w:name w:val="List Table 5 Dark - Accent 6"/>
-    <w:basedOn w:val="733"/>
+    <w:basedOn w:val="901"/>
     <w:uiPriority w:val="99"/>
     <w:pPr>
       <w:pBdr/>
@@ -24910,9 +25085,9 @@
       </w:tcPr>
     </w:tblStylePr>
   </w:style>
-  <w:style w:type="table" w:styleId="103">
+  <w:style w:type="table" w:styleId="813">
     <w:name w:val="List Table 6 Colorful"/>
-    <w:basedOn w:val="733"/>
+    <w:basedOn w:val="901"/>
     <w:uiPriority w:val="99"/>
     <w:pPr>
       <w:pBdr/>
@@ -25133,9 +25308,9 @@
       </w:tcPr>
     </w:tblStylePr>
   </w:style>
-  <w:style w:type="table" w:styleId="104">
+  <w:style w:type="table" w:styleId="814">
     <w:name w:val="List Table 6 Colorful - Accent 1"/>
-    <w:basedOn w:val="733"/>
+    <w:basedOn w:val="901"/>
     <w:uiPriority w:val="99"/>
     <w:pPr>
       <w:pBdr/>
@@ -25356,9 +25531,9 @@
       </w:tcPr>
     </w:tblStylePr>
   </w:style>
-  <w:style w:type="table" w:styleId="105">
+  <w:style w:type="table" w:styleId="815">
     <w:name w:val="List Table 6 Colorful - Accent 2"/>
-    <w:basedOn w:val="733"/>
+    <w:basedOn w:val="901"/>
     <w:uiPriority w:val="99"/>
     <w:pPr>
       <w:pBdr/>
@@ -25579,9 +25754,9 @@
       </w:tcPr>
     </w:tblStylePr>
   </w:style>
-  <w:style w:type="table" w:styleId="106">
+  <w:style w:type="table" w:styleId="816">
     <w:name w:val="List Table 6 Colorful - Accent 3"/>
-    <w:basedOn w:val="733"/>
+    <w:basedOn w:val="901"/>
     <w:uiPriority w:val="99"/>
     <w:pPr>
       <w:pBdr/>
@@ -25802,9 +25977,9 @@
       </w:tcPr>
     </w:tblStylePr>
   </w:style>
-  <w:style w:type="table" w:styleId="107">
+  <w:style w:type="table" w:styleId="817">
     <w:name w:val="List Table 6 Colorful - Accent 4"/>
-    <w:basedOn w:val="733"/>
+    <w:basedOn w:val="901"/>
     <w:uiPriority w:val="99"/>
     <w:pPr>
       <w:pBdr/>
@@ -26025,9 +26200,9 @@
       </w:tcPr>
     </w:tblStylePr>
   </w:style>
-  <w:style w:type="table" w:styleId="108">
+  <w:style w:type="table" w:styleId="818">
     <w:name w:val="List Table 6 Colorful - Accent 5"/>
-    <w:basedOn w:val="733"/>
+    <w:basedOn w:val="901"/>
     <w:uiPriority w:val="99"/>
     <w:pPr>
       <w:pBdr/>
@@ -26248,9 +26423,9 @@
       </w:tcPr>
     </w:tblStylePr>
   </w:style>
-  <w:style w:type="table" w:styleId="109">
+  <w:style w:type="table" w:styleId="819">
     <w:name w:val="List Table 6 Colorful - Accent 6"/>
-    <w:basedOn w:val="733"/>
+    <w:basedOn w:val="901"/>
     <w:uiPriority w:val="99"/>
     <w:pPr>
       <w:pBdr/>
@@ -26471,9 +26646,9 @@
       </w:tcPr>
     </w:tblStylePr>
   </w:style>
-  <w:style w:type="table" w:styleId="110">
+  <w:style w:type="table" w:styleId="820">
     <w:name w:val="List Table 7 Colorful"/>
-    <w:basedOn w:val="733"/>
+    <w:basedOn w:val="901"/>
     <w:uiPriority w:val="99"/>
     <w:pPr>
       <w:pBdr/>
@@ -26572,11 +26747,11 @@
         <w:tblBorders/>
       </w:tblPr>
       <w:tcPr>
-        <w:shd w:color="ffffff"/>
+        <w:shd w:val="clear" w:color="ffffff"/>
         <w:tcBorders>
-          <w:top w:val="none"/>
-          <w:left w:val="none"/>
-          <w:bottom w:val="none"/>
+          <w:top w:val="none" w:color="000000" w:sz="4" w:space="0"/>
+          <w:left w:val="none" w:color="000000" w:sz="4" w:space="0"/>
+          <w:bottom w:val="none" w:color="000000" w:sz="4" w:space="0"/>
           <w:right w:val="single" w:color="000000" w:themeColor="text1" w:themeTint="80" w:sz="4" w:space="0"/>
         </w:tcBorders>
       </w:tcPr>
@@ -26599,10 +26774,10 @@
       <w:tcPr>
         <w:shd w:val="clear" w:color="ffffff" w:themeColor="light1" w:fill="ffffff" w:themeFill="light1"/>
         <w:tcBorders>
-          <w:top w:val="none"/>
-          <w:left w:val="none"/>
+          <w:top w:val="none" w:color="000000" w:sz="4" w:space="0"/>
+          <w:left w:val="none" w:color="000000" w:sz="4" w:space="0"/>
           <w:bottom w:val="single" w:color="000000" w:themeColor="text1" w:themeTint="80" w:sz="4" w:space="0"/>
-          <w:right w:val="none"/>
+          <w:right w:val="none" w:color="000000" w:sz="4" w:space="0"/>
         </w:tcBorders>
       </w:tcPr>
     </w:tblStylePr>
@@ -26622,12 +26797,12 @@
         <w:tblBorders/>
       </w:tblPr>
       <w:tcPr>
-        <w:shd w:color="ffffff"/>
+        <w:shd w:val="clear" w:color="ffffff"/>
         <w:tcBorders>
-          <w:top w:val="none"/>
+          <w:top w:val="none" w:color="000000" w:sz="4" w:space="0"/>
           <w:left w:val="single" w:color="000000" w:themeColor="text1" w:themeTint="80" w:sz="4" w:space="0"/>
-          <w:bottom w:val="none"/>
-          <w:right w:val="none"/>
+          <w:bottom w:val="none" w:color="000000" w:sz="4" w:space="0"/>
+          <w:right w:val="none" w:color="000000" w:sz="4" w:space="0"/>
         </w:tcBorders>
       </w:tcPr>
     </w:tblStylePr>
@@ -26650,9 +26825,9 @@
         <w:shd w:val="clear" w:color="ffffff" w:themeColor="light1" w:fill="ffffff" w:themeFill="light1"/>
         <w:tcBorders>
           <w:top w:val="single" w:color="000000" w:themeColor="text1" w:themeTint="80" w:sz="4" w:space="0"/>
-          <w:left w:val="none"/>
-          <w:bottom w:val="none"/>
-          <w:right w:val="none"/>
+          <w:left w:val="none" w:color="000000" w:sz="4" w:space="0"/>
+          <w:bottom w:val="none" w:color="000000" w:sz="4" w:space="0"/>
+          <w:right w:val="none" w:color="000000" w:sz="4" w:space="0"/>
         </w:tcBorders>
       </w:tcPr>
     </w:tblStylePr>
@@ -26727,9 +26902,9 @@
       </w:tcPr>
     </w:tblStylePr>
   </w:style>
-  <w:style w:type="table" w:styleId="111">
+  <w:style w:type="table" w:styleId="821">
     <w:name w:val="List Table 7 Colorful - Accent 1"/>
-    <w:basedOn w:val="733"/>
+    <w:basedOn w:val="901"/>
     <w:uiPriority w:val="99"/>
     <w:pPr>
       <w:pBdr/>
@@ -26828,11 +27003,11 @@
         <w:tblBorders/>
       </w:tblPr>
       <w:tcPr>
-        <w:shd w:color="ffffff"/>
+        <w:shd w:val="clear" w:color="ffffff"/>
         <w:tcBorders>
-          <w:top w:val="none"/>
-          <w:left w:val="none"/>
-          <w:bottom w:val="none"/>
+          <w:top w:val="none" w:color="000000" w:sz="4" w:space="0"/>
+          <w:left w:val="none" w:color="000000" w:sz="4" w:space="0"/>
+          <w:bottom w:val="none" w:color="000000" w:sz="4" w:space="0"/>
           <w:right w:val="single" w:color="000000" w:themeColor="accent1" w:sz="4" w:space="0"/>
         </w:tcBorders>
       </w:tcPr>
@@ -26855,10 +27030,10 @@
       <w:tcPr>
         <w:shd w:val="clear" w:color="ffffff" w:themeColor="light1" w:fill="ffffff" w:themeFill="light1"/>
         <w:tcBorders>
-          <w:top w:val="none"/>
-          <w:left w:val="none"/>
+          <w:top w:val="none" w:color="000000" w:sz="4" w:space="0"/>
+          <w:left w:val="none" w:color="000000" w:sz="4" w:space="0"/>
           <w:bottom w:val="single" w:color="000000" w:themeColor="accent1" w:sz="4" w:space="0"/>
-          <w:right w:val="none"/>
+          <w:right w:val="none" w:color="000000" w:sz="4" w:space="0"/>
         </w:tcBorders>
       </w:tcPr>
     </w:tblStylePr>
@@ -26878,12 +27053,12 @@
         <w:tblBorders/>
       </w:tblPr>
       <w:tcPr>
-        <w:shd w:color="ffffff"/>
+        <w:shd w:val="clear" w:color="ffffff"/>
         <w:tcBorders>
-          <w:top w:val="none"/>
+          <w:top w:val="none" w:color="000000" w:sz="4" w:space="0"/>
           <w:left w:val="single" w:color="000000" w:themeColor="accent1" w:sz="4" w:space="0"/>
-          <w:bottom w:val="none"/>
-          <w:right w:val="none"/>
+          <w:bottom w:val="none" w:color="000000" w:sz="4" w:space="0"/>
+          <w:right w:val="none" w:color="000000" w:sz="4" w:space="0"/>
         </w:tcBorders>
       </w:tcPr>
     </w:tblStylePr>
@@ -26906,9 +27081,9 @@
         <w:shd w:val="clear" w:color="ffffff" w:themeColor="light1" w:fill="ffffff" w:themeFill="light1"/>
         <w:tcBorders>
           <w:top w:val="single" w:color="000000" w:themeColor="accent1" w:sz="4" w:space="0"/>
-          <w:left w:val="none"/>
-          <w:bottom w:val="none"/>
-          <w:right w:val="none"/>
+          <w:left w:val="none" w:color="000000" w:sz="4" w:space="0"/>
+          <w:bottom w:val="none" w:color="000000" w:sz="4" w:space="0"/>
+          <w:right w:val="none" w:color="000000" w:sz="4" w:space="0"/>
         </w:tcBorders>
       </w:tcPr>
     </w:tblStylePr>
@@ -26983,9 +27158,9 @@
       </w:tcPr>
     </w:tblStylePr>
   </w:style>
-  <w:style w:type="table" w:styleId="112">
+  <w:style w:type="table" w:styleId="822">
     <w:name w:val="List Table 7 Colorful - Accent 2"/>
-    <w:basedOn w:val="733"/>
+    <w:basedOn w:val="901"/>
     <w:uiPriority w:val="99"/>
     <w:pPr>
       <w:pBdr/>
@@ -27084,11 +27259,11 @@
         <w:tblBorders/>
       </w:tblPr>
       <w:tcPr>
-        <w:shd w:color="ffffff"/>
+        <w:shd w:val="clear" w:color="ffffff"/>
         <w:tcBorders>
-          <w:top w:val="none"/>
-          <w:left w:val="none"/>
-          <w:bottom w:val="none"/>
+          <w:top w:val="none" w:color="000000" w:sz="4" w:space="0"/>
+          <w:left w:val="none" w:color="000000" w:sz="4" w:space="0"/>
+          <w:bottom w:val="none" w:color="000000" w:sz="4" w:space="0"/>
           <w:right w:val="single" w:color="000000" w:themeColor="accent2" w:themeTint="97" w:sz="4" w:space="0"/>
         </w:tcBorders>
       </w:tcPr>
@@ -27111,10 +27286,10 @@
       <w:tcPr>
         <w:shd w:val="clear" w:color="ffffff" w:themeColor="light1" w:fill="ffffff" w:themeFill="light1"/>
         <w:tcBorders>
-          <w:top w:val="none"/>
-          <w:left w:val="none"/>
+          <w:top w:val="none" w:color="000000" w:sz="4" w:space="0"/>
+          <w:left w:val="none" w:color="000000" w:sz="4" w:space="0"/>
           <w:bottom w:val="single" w:color="000000" w:themeColor="accent2" w:themeTint="97" w:sz="4" w:space="0"/>
-          <w:right w:val="none"/>
+          <w:right w:val="none" w:color="000000" w:sz="4" w:space="0"/>
         </w:tcBorders>
       </w:tcPr>
     </w:tblStylePr>
@@ -27134,12 +27309,12 @@
         <w:tblBorders/>
       </w:tblPr>
       <w:tcPr>
-        <w:shd w:color="ffffff"/>
+        <w:shd w:val="clear" w:color="ffffff"/>
         <w:tcBorders>
-          <w:top w:val="none"/>
+          <w:top w:val="none" w:color="000000" w:sz="4" w:space="0"/>
           <w:left w:val="single" w:color="000000" w:themeColor="accent2" w:themeTint="97" w:sz="4" w:space="0"/>
-          <w:bottom w:val="none"/>
-          <w:right w:val="none"/>
+          <w:bottom w:val="none" w:color="000000" w:sz="4" w:space="0"/>
+          <w:right w:val="none" w:color="000000" w:sz="4" w:space="0"/>
         </w:tcBorders>
       </w:tcPr>
     </w:tblStylePr>
@@ -27162,9 +27337,9 @@
         <w:shd w:val="clear" w:color="ffffff" w:themeColor="light1" w:fill="ffffff" w:themeFill="light1"/>
         <w:tcBorders>
           <w:top w:val="single" w:color="000000" w:themeColor="accent2" w:themeTint="97" w:sz="4" w:space="0"/>
-          <w:left w:val="none"/>
-          <w:bottom w:val="none"/>
-          <w:right w:val="none"/>
+          <w:left w:val="none" w:color="000000" w:sz="4" w:space="0"/>
+          <w:bottom w:val="none" w:color="000000" w:sz="4" w:space="0"/>
+          <w:right w:val="none" w:color="000000" w:sz="4" w:space="0"/>
         </w:tcBorders>
       </w:tcPr>
     </w:tblStylePr>
@@ -27239,9 +27414,9 @@
       </w:tcPr>
     </w:tblStylePr>
   </w:style>
-  <w:style w:type="table" w:styleId="113">
+  <w:style w:type="table" w:styleId="823">
     <w:name w:val="List Table 7 Colorful - Accent 3"/>
-    <w:basedOn w:val="733"/>
+    <w:basedOn w:val="901"/>
     <w:uiPriority w:val="99"/>
     <w:pPr>
       <w:pBdr/>
@@ -27340,11 +27515,11 @@
         <w:tblBorders/>
       </w:tblPr>
       <w:tcPr>
-        <w:shd w:color="ffffff"/>
+        <w:shd w:val="clear" w:color="ffffff"/>
         <w:tcBorders>
-          <w:top w:val="none"/>
-          <w:left w:val="none"/>
-          <w:bottom w:val="none"/>
+          <w:top w:val="none" w:color="000000" w:sz="4" w:space="0"/>
+          <w:left w:val="none" w:color="000000" w:sz="4" w:space="0"/>
+          <w:bottom w:val="none" w:color="000000" w:sz="4" w:space="0"/>
           <w:right w:val="single" w:color="000000" w:themeColor="accent3" w:themeTint="98" w:sz="4" w:space="0"/>
         </w:tcBorders>
       </w:tcPr>
@@ -27367,10 +27542,10 @@
       <w:tcPr>
         <w:shd w:val="clear" w:color="ffffff" w:themeColor="light1" w:fill="ffffff" w:themeFill="light1"/>
         <w:tcBorders>
-          <w:top w:val="none"/>
-          <w:left w:val="none"/>
+          <w:top w:val="none" w:color="000000" w:sz="4" w:space="0"/>
+          <w:left w:val="none" w:color="000000" w:sz="4" w:space="0"/>
           <w:bottom w:val="single" w:color="000000" w:themeColor="accent3" w:themeTint="98" w:sz="4" w:space="0"/>
-          <w:right w:val="none"/>
+          <w:right w:val="none" w:color="000000" w:sz="4" w:space="0"/>
         </w:tcBorders>
       </w:tcPr>
     </w:tblStylePr>
@@ -27390,12 +27565,12 @@
         <w:tblBorders/>
       </w:tblPr>
       <w:tcPr>
-        <w:shd w:color="ffffff"/>
+        <w:shd w:val="clear" w:color="ffffff"/>
         <w:tcBorders>
-          <w:top w:val="none"/>
+          <w:top w:val="none" w:color="000000" w:sz="4" w:space="0"/>
           <w:left w:val="single" w:color="000000" w:themeColor="accent3" w:themeTint="98" w:sz="4" w:space="0"/>
-          <w:bottom w:val="none"/>
-          <w:right w:val="none"/>
+          <w:bottom w:val="none" w:color="000000" w:sz="4" w:space="0"/>
+          <w:right w:val="none" w:color="000000" w:sz="4" w:space="0"/>
         </w:tcBorders>
       </w:tcPr>
     </w:tblStylePr>
@@ -27418,9 +27593,9 @@
         <w:shd w:val="clear" w:color="ffffff" w:themeColor="light1" w:fill="ffffff" w:themeFill="light1"/>
         <w:tcBorders>
           <w:top w:val="single" w:color="000000" w:themeColor="accent3" w:themeTint="98" w:sz="4" w:space="0"/>
-          <w:left w:val="none"/>
-          <w:bottom w:val="none"/>
-          <w:right w:val="none"/>
+          <w:left w:val="none" w:color="000000" w:sz="4" w:space="0"/>
+          <w:bottom w:val="none" w:color="000000" w:sz="4" w:space="0"/>
+          <w:right w:val="none" w:color="000000" w:sz="4" w:space="0"/>
         </w:tcBorders>
       </w:tcPr>
     </w:tblStylePr>
@@ -27495,9 +27670,9 @@
       </w:tcPr>
     </w:tblStylePr>
   </w:style>
-  <w:style w:type="table" w:styleId="114">
+  <w:style w:type="table" w:styleId="824">
     <w:name w:val="List Table 7 Colorful - Accent 4"/>
-    <w:basedOn w:val="733"/>
+    <w:basedOn w:val="901"/>
     <w:uiPriority w:val="99"/>
     <w:pPr>
       <w:pBdr/>
@@ -27596,11 +27771,11 @@
         <w:tblBorders/>
       </w:tblPr>
       <w:tcPr>
-        <w:shd w:color="ffffff"/>
+        <w:shd w:val="clear" w:color="ffffff"/>
         <w:tcBorders>
-          <w:top w:val="none"/>
-          <w:left w:val="none"/>
-          <w:bottom w:val="none"/>
+          <w:top w:val="none" w:color="000000" w:sz="4" w:space="0"/>
+          <w:left w:val="none" w:color="000000" w:sz="4" w:space="0"/>
+          <w:bottom w:val="none" w:color="000000" w:sz="4" w:space="0"/>
           <w:right w:val="single" w:color="000000" w:themeColor="accent4" w:themeTint="9A" w:sz="4" w:space="0"/>
         </w:tcBorders>
       </w:tcPr>
@@ -27623,10 +27798,10 @@
       <w:tcPr>
         <w:shd w:val="clear" w:color="ffffff" w:themeColor="light1" w:fill="ffffff" w:themeFill="light1"/>
         <w:tcBorders>
-          <w:top w:val="none"/>
-          <w:left w:val="none"/>
+          <w:top w:val="none" w:color="000000" w:sz="4" w:space="0"/>
+          <w:left w:val="none" w:color="000000" w:sz="4" w:space="0"/>
           <w:bottom w:val="single" w:color="000000" w:themeColor="accent4" w:themeTint="9A" w:sz="4" w:space="0"/>
-          <w:right w:val="none"/>
+          <w:right w:val="none" w:color="000000" w:sz="4" w:space="0"/>
         </w:tcBorders>
       </w:tcPr>
     </w:tblStylePr>
@@ -27646,12 +27821,12 @@
         <w:tblBorders/>
       </w:tblPr>
       <w:tcPr>
-        <w:shd w:color="ffffff"/>
+        <w:shd w:val="clear" w:color="ffffff"/>
         <w:tcBorders>
-          <w:top w:val="none"/>
+          <w:top w:val="none" w:color="000000" w:sz="4" w:space="0"/>
           <w:left w:val="single" w:color="000000" w:themeColor="accent4" w:themeTint="9A" w:sz="4" w:space="0"/>
-          <w:bottom w:val="none"/>
-          <w:right w:val="none"/>
+          <w:bottom w:val="none" w:color="000000" w:sz="4" w:space="0"/>
+          <w:right w:val="none" w:color="000000" w:sz="4" w:space="0"/>
         </w:tcBorders>
       </w:tcPr>
     </w:tblStylePr>
@@ -27674,9 +27849,9 @@
         <w:shd w:val="clear" w:color="ffffff" w:themeColor="light1" w:fill="ffffff" w:themeFill="light1"/>
         <w:tcBorders>
           <w:top w:val="single" w:color="000000" w:themeColor="accent4" w:themeTint="9A" w:sz="4" w:space="0"/>
-          <w:left w:val="none"/>
-          <w:bottom w:val="none"/>
-          <w:right w:val="none"/>
+          <w:left w:val="none" w:color="000000" w:sz="4" w:space="0"/>
+          <w:bottom w:val="none" w:color="000000" w:sz="4" w:space="0"/>
+          <w:right w:val="none" w:color="000000" w:sz="4" w:space="0"/>
         </w:tcBorders>
       </w:tcPr>
     </w:tblStylePr>
@@ -27751,9 +27926,9 @@
       </w:tcPr>
     </w:tblStylePr>
   </w:style>
-  <w:style w:type="table" w:styleId="115">
+  <w:style w:type="table" w:styleId="825">
     <w:name w:val="List Table 7 Colorful - Accent 5"/>
-    <w:basedOn w:val="733"/>
+    <w:basedOn w:val="901"/>
     <w:uiPriority w:val="99"/>
     <w:pPr>
       <w:pBdr/>
@@ -27852,11 +28027,11 @@
         <w:tblBorders/>
       </w:tblPr>
       <w:tcPr>
-        <w:shd w:color="ffffff"/>
+        <w:shd w:val="clear" w:color="ffffff"/>
         <w:tcBorders>
-          <w:top w:val="none"/>
-          <w:left w:val="none"/>
-          <w:bottom w:val="none"/>
+          <w:top w:val="none" w:color="000000" w:sz="4" w:space="0"/>
+          <w:left w:val="none" w:color="000000" w:sz="4" w:space="0"/>
+          <w:bottom w:val="none" w:color="000000" w:sz="4" w:space="0"/>
           <w:right w:val="single" w:color="000000" w:themeColor="accent5" w:themeTint="9A" w:sz="4" w:space="0"/>
         </w:tcBorders>
       </w:tcPr>
@@ -27879,10 +28054,10 @@
       <w:tcPr>
         <w:shd w:val="clear" w:color="ffffff" w:themeColor="light1" w:fill="ffffff" w:themeFill="light1"/>
         <w:tcBorders>
-          <w:top w:val="none"/>
-          <w:left w:val="none"/>
+          <w:top w:val="none" w:color="000000" w:sz="4" w:space="0"/>
+          <w:left w:val="none" w:color="000000" w:sz="4" w:space="0"/>
           <w:bottom w:val="single" w:color="000000" w:themeColor="accent5" w:themeTint="9A" w:sz="4" w:space="0"/>
-          <w:right w:val="none"/>
+          <w:right w:val="none" w:color="000000" w:sz="4" w:space="0"/>
         </w:tcBorders>
       </w:tcPr>
     </w:tblStylePr>
@@ -27902,12 +28077,12 @@
         <w:tblBorders/>
       </w:tblPr>
       <w:tcPr>
-        <w:shd w:color="ffffff"/>
+        <w:shd w:val="clear" w:color="ffffff"/>
         <w:tcBorders>
-          <w:top w:val="none"/>
+          <w:top w:val="none" w:color="000000" w:sz="4" w:space="0"/>
           <w:left w:val="single" w:color="000000" w:themeColor="accent5" w:themeTint="9A" w:sz="4" w:space="0"/>
-          <w:bottom w:val="none"/>
-          <w:right w:val="none"/>
+          <w:bottom w:val="none" w:color="000000" w:sz="4" w:space="0"/>
+          <w:right w:val="none" w:color="000000" w:sz="4" w:space="0"/>
         </w:tcBorders>
       </w:tcPr>
     </w:tblStylePr>
@@ -27930,9 +28105,9 @@
         <w:shd w:val="clear" w:color="ffffff" w:themeColor="light1" w:fill="ffffff" w:themeFill="light1"/>
         <w:tcBorders>
           <w:top w:val="single" w:color="000000" w:themeColor="accent5" w:themeTint="9A" w:sz="4" w:space="0"/>
-          <w:left w:val="none"/>
-          <w:bottom w:val="none"/>
-          <w:right w:val="none"/>
+          <w:left w:val="none" w:color="000000" w:sz="4" w:space="0"/>
+          <w:bottom w:val="none" w:color="000000" w:sz="4" w:space="0"/>
+          <w:right w:val="none" w:color="000000" w:sz="4" w:space="0"/>
         </w:tcBorders>
       </w:tcPr>
     </w:tblStylePr>
@@ -28007,9 +28182,9 @@
       </w:tcPr>
     </w:tblStylePr>
   </w:style>
-  <w:style w:type="table" w:styleId="116">
+  <w:style w:type="table" w:styleId="826">
     <w:name w:val="List Table 7 Colorful - Accent 6"/>
-    <w:basedOn w:val="733"/>
+    <w:basedOn w:val="901"/>
     <w:uiPriority w:val="99"/>
     <w:pPr>
       <w:pBdr/>
@@ -28108,11 +28283,11 @@
         <w:tblBorders/>
       </w:tblPr>
       <w:tcPr>
-        <w:shd w:color="ffffff"/>
+        <w:shd w:val="clear" w:color="ffffff"/>
         <w:tcBorders>
-          <w:top w:val="none"/>
-          <w:left w:val="none"/>
-          <w:bottom w:val="none"/>
+          <w:top w:val="none" w:color="000000" w:sz="4" w:space="0"/>
+          <w:left w:val="none" w:color="000000" w:sz="4" w:space="0"/>
+          <w:bottom w:val="none" w:color="000000" w:sz="4" w:space="0"/>
           <w:right w:val="single" w:color="000000" w:themeColor="accent6" w:themeTint="98" w:sz="4" w:space="0"/>
         </w:tcBorders>
       </w:tcPr>
@@ -28135,10 +28310,10 @@
       <w:tcPr>
         <w:shd w:val="clear" w:color="ffffff" w:themeColor="light1" w:fill="ffffff" w:themeFill="light1"/>
         <w:tcBorders>
-          <w:top w:val="none"/>
-          <w:left w:val="none"/>
+          <w:top w:val="none" w:color="000000" w:sz="4" w:space="0"/>
+          <w:left w:val="none" w:color="000000" w:sz="4" w:space="0"/>
           <w:bottom w:val="single" w:color="000000" w:themeColor="accent6" w:themeTint="98" w:sz="4" w:space="0"/>
-          <w:right w:val="none"/>
+          <w:right w:val="none" w:color="000000" w:sz="4" w:space="0"/>
         </w:tcBorders>
       </w:tcPr>
     </w:tblStylePr>
@@ -28158,12 +28333,12 @@
         <w:tblBorders/>
       </w:tblPr>
       <w:tcPr>
-        <w:shd w:color="ffffff"/>
+        <w:shd w:val="clear" w:color="ffffff"/>
         <w:tcBorders>
-          <w:top w:val="none"/>
+          <w:top w:val="none" w:color="000000" w:sz="4" w:space="0"/>
           <w:left w:val="single" w:color="000000" w:themeColor="accent6" w:themeTint="98" w:sz="4" w:space="0"/>
-          <w:bottom w:val="none"/>
-          <w:right w:val="none"/>
+          <w:bottom w:val="none" w:color="000000" w:sz="4" w:space="0"/>
+          <w:right w:val="none" w:color="000000" w:sz="4" w:space="0"/>
         </w:tcBorders>
       </w:tcPr>
     </w:tblStylePr>
@@ -28186,9 +28361,9 @@
         <w:shd w:val="clear" w:color="ffffff" w:themeColor="light1" w:fill="ffffff" w:themeFill="light1"/>
         <w:tcBorders>
           <w:top w:val="single" w:color="000000" w:themeColor="accent6" w:themeTint="98" w:sz="4" w:space="0"/>
-          <w:left w:val="none"/>
-          <w:bottom w:val="none"/>
-          <w:right w:val="none"/>
+          <w:left w:val="none" w:color="000000" w:sz="4" w:space="0"/>
+          <w:bottom w:val="none" w:color="000000" w:sz="4" w:space="0"/>
+          <w:right w:val="none" w:color="000000" w:sz="4" w:space="0"/>
         </w:tcBorders>
       </w:tcPr>
     </w:tblStylePr>
@@ -28263,9 +28438,9 @@
       </w:tcPr>
     </w:tblStylePr>
   </w:style>
-  <w:style w:type="table" w:styleId="117">
+  <w:style w:type="table" w:styleId="827">
     <w:name w:val="Lined - Accent"/>
-    <w:basedOn w:val="733"/>
+    <w:basedOn w:val="901"/>
     <w:uiPriority w:val="99"/>
     <w:pPr>
       <w:pBdr/>
@@ -28500,9 +28675,9 @@
       </w:tcPr>
     </w:tblStylePr>
   </w:style>
-  <w:style w:type="table" w:styleId="118">
+  <w:style w:type="table" w:styleId="828">
     <w:name w:val="Lined - Accent 1"/>
-    <w:basedOn w:val="733"/>
+    <w:basedOn w:val="901"/>
     <w:uiPriority w:val="99"/>
     <w:pPr>
       <w:pBdr/>
@@ -28737,9 +28912,9 @@
       </w:tcPr>
     </w:tblStylePr>
   </w:style>
-  <w:style w:type="table" w:styleId="119">
+  <w:style w:type="table" w:styleId="829">
     <w:name w:val="Lined - Accent 2"/>
-    <w:basedOn w:val="733"/>
+    <w:basedOn w:val="901"/>
     <w:uiPriority w:val="99"/>
     <w:pPr>
       <w:pBdr/>
@@ -28974,9 +29149,9 @@
       </w:tcPr>
     </w:tblStylePr>
   </w:style>
-  <w:style w:type="table" w:styleId="120">
+  <w:style w:type="table" w:styleId="830">
     <w:name w:val="Lined - Accent 3"/>
-    <w:basedOn w:val="733"/>
+    <w:basedOn w:val="901"/>
     <w:uiPriority w:val="99"/>
     <w:pPr>
       <w:pBdr/>
@@ -29211,9 +29386,9 @@
       </w:tcPr>
     </w:tblStylePr>
   </w:style>
-  <w:style w:type="table" w:styleId="121">
+  <w:style w:type="table" w:styleId="831">
     <w:name w:val="Lined - Accent 4"/>
-    <w:basedOn w:val="733"/>
+    <w:basedOn w:val="901"/>
     <w:uiPriority w:val="99"/>
     <w:pPr>
       <w:pBdr/>
@@ -29448,9 +29623,9 @@
       </w:tcPr>
     </w:tblStylePr>
   </w:style>
-  <w:style w:type="table" w:styleId="122">
+  <w:style w:type="table" w:styleId="832">
     <w:name w:val="Lined - Accent 5"/>
-    <w:basedOn w:val="733"/>
+    <w:basedOn w:val="901"/>
     <w:uiPriority w:val="99"/>
     <w:pPr>
       <w:pBdr/>
@@ -29685,9 +29860,9 @@
       </w:tcPr>
     </w:tblStylePr>
   </w:style>
-  <w:style w:type="table" w:styleId="123">
+  <w:style w:type="table" w:styleId="833">
     <w:name w:val="Lined - Accent 6"/>
-    <w:basedOn w:val="733"/>
+    <w:basedOn w:val="901"/>
     <w:uiPriority w:val="99"/>
     <w:pPr>
       <w:pBdr/>
@@ -29922,9 +30097,9 @@
       </w:tcPr>
     </w:tblStylePr>
   </w:style>
-  <w:style w:type="table" w:styleId="124">
+  <w:style w:type="table" w:styleId="834">
     <w:name w:val="Bordered &amp; Lined - Accent"/>
-    <w:basedOn w:val="733"/>
+    <w:basedOn w:val="901"/>
     <w:uiPriority w:val="99"/>
     <w:pPr>
       <w:pBdr/>
@@ -30166,9 +30341,9 @@
       </w:tcPr>
     </w:tblStylePr>
   </w:style>
-  <w:style w:type="table" w:styleId="125">
+  <w:style w:type="table" w:styleId="835">
     <w:name w:val="Bordered &amp; Lined - Accent 1"/>
-    <w:basedOn w:val="733"/>
+    <w:basedOn w:val="901"/>
     <w:uiPriority w:val="99"/>
     <w:pPr>
       <w:pBdr/>
@@ -30410,9 +30585,9 @@
       </w:tcPr>
     </w:tblStylePr>
   </w:style>
-  <w:style w:type="table" w:styleId="126">
+  <w:style w:type="table" w:styleId="836">
     <w:name w:val="Bordered &amp; Lined - Accent 2"/>
-    <w:basedOn w:val="733"/>
+    <w:basedOn w:val="901"/>
     <w:uiPriority w:val="99"/>
     <w:pPr>
       <w:pBdr/>
@@ -30654,9 +30829,9 @@
       </w:tcPr>
     </w:tblStylePr>
   </w:style>
-  <w:style w:type="table" w:styleId="127">
+  <w:style w:type="table" w:styleId="837">
     <w:name w:val="Bordered &amp; Lined - Accent 3"/>
-    <w:basedOn w:val="733"/>
+    <w:basedOn w:val="901"/>
     <w:uiPriority w:val="99"/>
     <w:pPr>
       <w:pBdr/>
@@ -30898,9 +31073,9 @@
       </w:tcPr>
     </w:tblStylePr>
   </w:style>
-  <w:style w:type="table" w:styleId="128">
+  <w:style w:type="table" w:styleId="838">
     <w:name w:val="Bordered &amp; Lined - Accent 4"/>
-    <w:basedOn w:val="733"/>
+    <w:basedOn w:val="901"/>
     <w:uiPriority w:val="99"/>
     <w:pPr>
       <w:pBdr/>
@@ -31142,9 +31317,9 @@
       </w:tcPr>
     </w:tblStylePr>
   </w:style>
-  <w:style w:type="table" w:styleId="129">
+  <w:style w:type="table" w:styleId="839">
     <w:name w:val="Bordered &amp; Lined - Accent 5"/>
-    <w:basedOn w:val="733"/>
+    <w:basedOn w:val="901"/>
     <w:uiPriority w:val="99"/>
     <w:pPr>
       <w:pBdr/>
@@ -31386,9 +31561,9 @@
       </w:tcPr>
     </w:tblStylePr>
   </w:style>
-  <w:style w:type="table" w:styleId="130">
+  <w:style w:type="table" w:styleId="840">
     <w:name w:val="Bordered &amp; Lined - Accent 6"/>
-    <w:basedOn w:val="733"/>
+    <w:basedOn w:val="901"/>
     <w:uiPriority w:val="99"/>
     <w:pPr>
       <w:pBdr/>
@@ -31630,9 +31805,9 @@
       </w:tcPr>
     </w:tblStylePr>
   </w:style>
-  <w:style w:type="table" w:styleId="131">
+  <w:style w:type="table" w:styleId="841">
     <w:name w:val="Bordered"/>
-    <w:basedOn w:val="733"/>
+    <w:basedOn w:val="901"/>
     <w:uiPriority w:val="99"/>
     <w:pPr>
       <w:pBdr/>
@@ -31861,9 +32036,9 @@
       </w:tcPr>
     </w:tblStylePr>
   </w:style>
-  <w:style w:type="table" w:styleId="132">
+  <w:style w:type="table" w:styleId="842">
     <w:name w:val="Bordered - Accent 1"/>
-    <w:basedOn w:val="733"/>
+    <w:basedOn w:val="901"/>
     <w:uiPriority w:val="99"/>
     <w:pPr>
       <w:pBdr/>
@@ -32092,9 +32267,9 @@
       </w:tcPr>
     </w:tblStylePr>
   </w:style>
-  <w:style w:type="table" w:styleId="133">
+  <w:style w:type="table" w:styleId="843">
     <w:name w:val="Bordered - Accent 2"/>
-    <w:basedOn w:val="733"/>
+    <w:basedOn w:val="901"/>
     <w:uiPriority w:val="99"/>
     <w:pPr>
       <w:pBdr/>
@@ -32323,9 +32498,9 @@
       </w:tcPr>
     </w:tblStylePr>
   </w:style>
-  <w:style w:type="table" w:styleId="134">
+  <w:style w:type="table" w:styleId="844">
     <w:name w:val="Bordered - Accent 3"/>
-    <w:basedOn w:val="733"/>
+    <w:basedOn w:val="901"/>
     <w:uiPriority w:val="99"/>
     <w:pPr>
       <w:pBdr/>
@@ -32554,9 +32729,9 @@
       </w:tcPr>
     </w:tblStylePr>
   </w:style>
-  <w:style w:type="table" w:styleId="135">
+  <w:style w:type="table" w:styleId="845">
     <w:name w:val="Bordered - Accent 4"/>
-    <w:basedOn w:val="733"/>
+    <w:basedOn w:val="901"/>
     <w:uiPriority w:val="99"/>
     <w:pPr>
       <w:pBdr/>
@@ -32785,9 +32960,9 @@
       </w:tcPr>
     </w:tblStylePr>
   </w:style>
-  <w:style w:type="table" w:styleId="136">
+  <w:style w:type="table" w:styleId="846">
     <w:name w:val="Bordered - Accent 5"/>
-    <w:basedOn w:val="733"/>
+    <w:basedOn w:val="901"/>
     <w:uiPriority w:val="99"/>
     <w:pPr>
       <w:pBdr/>
@@ -33016,9 +33191,9 @@
       </w:tcPr>
     </w:tblStylePr>
   </w:style>
-  <w:style w:type="table" w:styleId="137">
+  <w:style w:type="table" w:styleId="847">
     <w:name w:val="Bordered - Accent 6"/>
-    <w:basedOn w:val="733"/>
+    <w:basedOn w:val="901"/>
     <w:uiPriority w:val="99"/>
     <w:pPr>
       <w:pBdr/>
@@ -33247,10 +33422,10 @@
       </w:tcPr>
     </w:tblStylePr>
   </w:style>
-  <w:style w:type="character" w:styleId="150">
+  <w:style w:type="character" w:styleId="848">
     <w:name w:val="Heading 1 Char"/>
-    <w:basedOn w:val="732"/>
-    <w:link w:val="723"/>
+    <w:basedOn w:val="900"/>
+    <w:link w:val="891"/>
     <w:uiPriority w:val="9"/>
     <w:pPr>
       <w:pBdr/>
@@ -33264,10 +33439,10 @@
       <w:szCs w:val="40"/>
     </w:rPr>
   </w:style>
-  <w:style w:type="character" w:styleId="151">
+  <w:style w:type="character" w:styleId="849">
     <w:name w:val="Heading 2 Char"/>
-    <w:basedOn w:val="732"/>
-    <w:link w:val="724"/>
+    <w:basedOn w:val="900"/>
+    <w:link w:val="892"/>
     <w:uiPriority w:val="9"/>
     <w:pPr>
       <w:pBdr/>
@@ -33281,10 +33456,10 @@
       <w:szCs w:val="32"/>
     </w:rPr>
   </w:style>
-  <w:style w:type="character" w:styleId="152">
+  <w:style w:type="character" w:styleId="850">
     <w:name w:val="Heading 3 Char"/>
-    <w:basedOn w:val="732"/>
-    <w:link w:val="725"/>
+    <w:basedOn w:val="900"/>
+    <w:link w:val="893"/>
     <w:uiPriority w:val="9"/>
     <w:pPr>
       <w:pBdr/>
@@ -33298,10 +33473,10 @@
       <w:szCs w:val="28"/>
     </w:rPr>
   </w:style>
-  <w:style w:type="character" w:styleId="153">
+  <w:style w:type="character" w:styleId="851">
     <w:name w:val="Heading 4 Char"/>
-    <w:basedOn w:val="732"/>
-    <w:link w:val="726"/>
+    <w:basedOn w:val="900"/>
+    <w:link w:val="894"/>
     <w:uiPriority w:val="9"/>
     <w:pPr>
       <w:pBdr/>
@@ -33315,10 +33490,10 @@
       <w:color w:val="0f4761" w:themeColor="accent1" w:themeShade="BF"/>
     </w:rPr>
   </w:style>
-  <w:style w:type="character" w:styleId="154">
+  <w:style w:type="character" w:styleId="852">
     <w:name w:val="Heading 5 Char"/>
-    <w:basedOn w:val="732"/>
-    <w:link w:val="727"/>
+    <w:basedOn w:val="900"/>
+    <w:link w:val="895"/>
     <w:uiPriority w:val="9"/>
     <w:pPr>
       <w:pBdr/>
@@ -33330,10 +33505,10 @@
       <w:color w:val="0f4761" w:themeColor="accent1" w:themeShade="BF"/>
     </w:rPr>
   </w:style>
-  <w:style w:type="character" w:styleId="155">
+  <w:style w:type="character" w:styleId="853">
     <w:name w:val="Heading 6 Char"/>
-    <w:basedOn w:val="732"/>
-    <w:link w:val="728"/>
+    <w:basedOn w:val="900"/>
+    <w:link w:val="896"/>
     <w:uiPriority w:val="9"/>
     <w:pPr>
       <w:pBdr/>
@@ -33347,10 +33522,10 @@
       <w:color w:val="595959" w:themeColor="text1" w:themeTint="A6"/>
     </w:rPr>
   </w:style>
-  <w:style w:type="character" w:styleId="156">
+  <w:style w:type="character" w:styleId="854">
     <w:name w:val="Heading 7 Char"/>
-    <w:basedOn w:val="732"/>
-    <w:link w:val="729"/>
+    <w:basedOn w:val="900"/>
+    <w:link w:val="897"/>
     <w:uiPriority w:val="9"/>
     <w:pPr>
       <w:pBdr/>
@@ -33362,10 +33537,10 @@
       <w:color w:val="595959" w:themeColor="text1" w:themeTint="A6"/>
     </w:rPr>
   </w:style>
-  <w:style w:type="character" w:styleId="157">
+  <w:style w:type="character" w:styleId="855">
     <w:name w:val="Heading 8 Char"/>
-    <w:basedOn w:val="732"/>
-    <w:link w:val="730"/>
+    <w:basedOn w:val="900"/>
+    <w:link w:val="898"/>
     <w:uiPriority w:val="9"/>
     <w:pPr>
       <w:pBdr/>
@@ -33379,10 +33554,10 @@
       <w:color w:val="272727" w:themeColor="text1" w:themeTint="D8"/>
     </w:rPr>
   </w:style>
-  <w:style w:type="character" w:styleId="158">
+  <w:style w:type="character" w:styleId="856">
     <w:name w:val="Heading 9 Char"/>
-    <w:basedOn w:val="732"/>
-    <w:link w:val="731"/>
+    <w:basedOn w:val="900"/>
+    <w:link w:val="899"/>
     <w:uiPriority w:val="9"/>
     <w:pPr>
       <w:pBdr/>
@@ -33396,10 +33571,10 @@
       <w:color w:val="272727" w:themeColor="text1" w:themeTint="D8"/>
     </w:rPr>
   </w:style>
-  <w:style w:type="character" w:styleId="160">
+  <w:style w:type="character" w:styleId="857">
     <w:name w:val="Title Char"/>
-    <w:basedOn w:val="732"/>
-    <w:link w:val="744"/>
+    <w:basedOn w:val="900"/>
+    <w:link w:val="912"/>
     <w:uiPriority w:val="10"/>
     <w:pPr>
       <w:pBdr/>
@@ -33413,10 +33588,10 @@
       <w:szCs w:val="56"/>
     </w:rPr>
   </w:style>
-  <w:style w:type="character" w:styleId="162">
+  <w:style w:type="character" w:styleId="858">
     <w:name w:val="Subtitle Char"/>
-    <w:basedOn w:val="732"/>
-    <w:link w:val="746"/>
+    <w:basedOn w:val="900"/>
+    <w:link w:val="914"/>
     <w:uiPriority w:val="11"/>
     <w:pPr>
       <w:pBdr/>
@@ -33430,10 +33605,10 @@
       <w:szCs w:val="28"/>
     </w:rPr>
   </w:style>
-  <w:style w:type="character" w:styleId="164">
+  <w:style w:type="character" w:styleId="859">
     <w:name w:val="Quote Char"/>
-    <w:basedOn w:val="732"/>
-    <w:link w:val="748"/>
+    <w:basedOn w:val="900"/>
+    <w:link w:val="916"/>
     <w:uiPriority w:val="29"/>
     <w:pPr>
       <w:pBdr/>
@@ -33446,10 +33621,10 @@
       <w:color w:val="404040" w:themeColor="text1" w:themeTint="BF"/>
     </w:rPr>
   </w:style>
-  <w:style w:type="character" w:styleId="168">
+  <w:style w:type="character" w:styleId="860">
     <w:name w:val="Intense Quote Char"/>
-    <w:basedOn w:val="732"/>
-    <w:link w:val="752"/>
+    <w:basedOn w:val="900"/>
+    <w:link w:val="920"/>
     <w:uiPriority w:val="30"/>
     <w:pPr>
       <w:pBdr/>
@@ -33462,9 +33637,9 @@
       <w:color w:val="0f4761" w:themeColor="accent1" w:themeShade="BF"/>
     </w:rPr>
   </w:style>
-  <w:style w:type="paragraph" w:styleId="170">
+  <w:style w:type="paragraph" w:styleId="861">
     <w:name w:val="No Spacing"/>
-    <w:basedOn w:val="722"/>
+    <w:basedOn w:val="890"/>
     <w:uiPriority w:val="1"/>
     <w:qFormat/>
     <w:pPr>
@@ -33473,9 +33648,9 @@
       <w:ind/>
     </w:pPr>
   </w:style>
-  <w:style w:type="character" w:styleId="171">
+  <w:style w:type="character" w:styleId="862">
     <w:name w:val="Subtle Emphasis"/>
-    <w:basedOn w:val="732"/>
+    <w:basedOn w:val="900"/>
     <w:uiPriority w:val="19"/>
     <w:qFormat/>
     <w:pPr>
@@ -33489,9 +33664,9 @@
       <w:color w:val="404040" w:themeColor="text1" w:themeTint="BF"/>
     </w:rPr>
   </w:style>
-  <w:style w:type="character" w:styleId="172">
+  <w:style w:type="character" w:styleId="863">
     <w:name w:val="Emphasis"/>
-    <w:basedOn w:val="732"/>
+    <w:basedOn w:val="900"/>
     <w:uiPriority w:val="20"/>
     <w:qFormat/>
     <w:pPr>
@@ -33504,9 +33679,9 @@
       <w:iCs/>
     </w:rPr>
   </w:style>
-  <w:style w:type="character" w:styleId="173">
+  <w:style w:type="character" w:styleId="864">
     <w:name w:val="Strong"/>
-    <w:basedOn w:val="732"/>
+    <w:basedOn w:val="900"/>
     <w:uiPriority w:val="22"/>
     <w:qFormat/>
     <w:pPr>
@@ -33519,9 +33694,9 @@
       <w:bCs/>
     </w:rPr>
   </w:style>
-  <w:style w:type="character" w:styleId="174">
+  <w:style w:type="character" w:styleId="865">
     <w:name w:val="Subtle Reference"/>
-    <w:basedOn w:val="732"/>
+    <w:basedOn w:val="900"/>
     <w:uiPriority w:val="31"/>
     <w:qFormat/>
     <w:pPr>
@@ -33534,9 +33709,9 @@
       <w:color w:val="5a5a5a" w:themeColor="text1" w:themeTint="A5"/>
     </w:rPr>
   </w:style>
-  <w:style w:type="character" w:styleId="175">
+  <w:style w:type="character" w:styleId="866">
     <w:name w:val="Book Title"/>
-    <w:basedOn w:val="732"/>
+    <w:basedOn w:val="900"/>
     <w:uiPriority w:val="33"/>
     <w:qFormat/>
     <w:pPr>
@@ -33552,10 +33727,10 @@
       <w:spacing w:val="5"/>
     </w:rPr>
   </w:style>
-  <w:style w:type="character" w:styleId="177">
+  <w:style w:type="character" w:styleId="867">
     <w:name w:val="Header Char"/>
-    <w:basedOn w:val="732"/>
-    <w:link w:val="755"/>
+    <w:basedOn w:val="900"/>
+    <w:link w:val="923"/>
     <w:uiPriority w:val="99"/>
     <w:pPr>
       <w:pBdr/>
@@ -33563,10 +33738,10 @@
       <w:ind/>
     </w:pPr>
   </w:style>
-  <w:style w:type="character" w:styleId="179">
+  <w:style w:type="character" w:styleId="868">
     <w:name w:val="Footer Char"/>
-    <w:basedOn w:val="732"/>
-    <w:link w:val="757"/>
+    <w:basedOn w:val="900"/>
+    <w:link w:val="925"/>
     <w:uiPriority w:val="99"/>
     <w:pPr>
       <w:pBdr/>
@@ -33574,10 +33749,10 @@
       <w:ind/>
     </w:pPr>
   </w:style>
-  <w:style w:type="paragraph" w:styleId="180">
+  <w:style w:type="paragraph" w:styleId="869">
     <w:name w:val="Caption"/>
-    <w:basedOn w:val="722"/>
-    <w:next w:val="722"/>
+    <w:basedOn w:val="890"/>
+    <w:next w:val="890"/>
     <w:uiPriority w:val="35"/>
     <w:unhideWhenUsed/>
     <w:qFormat/>
@@ -33594,10 +33769,10 @@
       <w:szCs w:val="18"/>
     </w:rPr>
   </w:style>
-  <w:style w:type="paragraph" w:styleId="181">
+  <w:style w:type="paragraph" w:styleId="870">
     <w:name w:val="footnote text"/>
-    <w:basedOn w:val="722"/>
-    <w:link w:val="182"/>
+    <w:basedOn w:val="890"/>
+    <w:link w:val="871"/>
     <w:uiPriority w:val="99"/>
     <w:semiHidden/>
     <w:unhideWhenUsed/>
@@ -33611,10 +33786,10 @@
       <w:szCs w:val="20"/>
     </w:rPr>
   </w:style>
-  <w:style w:type="character" w:styleId="182">
+  <w:style w:type="character" w:styleId="871">
     <w:name w:val="Footnote Text Char"/>
-    <w:basedOn w:val="732"/>
-    <w:link w:val="181"/>
+    <w:basedOn w:val="900"/>
+    <w:link w:val="870"/>
     <w:uiPriority w:val="99"/>
     <w:semiHidden/>
     <w:pPr>
@@ -33627,9 +33802,9 @@
       <w:szCs w:val="20"/>
     </w:rPr>
   </w:style>
-  <w:style w:type="character" w:styleId="183">
+  <w:style w:type="character" w:styleId="872">
     <w:name w:val="footnote reference"/>
-    <w:basedOn w:val="732"/>
+    <w:basedOn w:val="900"/>
     <w:uiPriority w:val="99"/>
     <w:semiHidden/>
     <w:unhideWhenUsed/>
@@ -33642,10 +33817,10 @@
       <w:vertAlign w:val="superscript"/>
     </w:rPr>
   </w:style>
-  <w:style w:type="paragraph" w:styleId="184">
+  <w:style w:type="paragraph" w:styleId="873">
     <w:name w:val="endnote text"/>
-    <w:basedOn w:val="722"/>
-    <w:link w:val="185"/>
+    <w:basedOn w:val="890"/>
+    <w:link w:val="874"/>
     <w:uiPriority w:val="99"/>
     <w:semiHidden/>
     <w:unhideWhenUsed/>
@@ -33659,10 +33834,10 @@
       <w:szCs w:val="20"/>
     </w:rPr>
   </w:style>
-  <w:style w:type="character" w:styleId="185">
+  <w:style w:type="character" w:styleId="874">
     <w:name w:val="Endnote Text Char"/>
-    <w:basedOn w:val="732"/>
-    <w:link w:val="184"/>
+    <w:basedOn w:val="900"/>
+    <w:link w:val="873"/>
     <w:uiPriority w:val="99"/>
     <w:semiHidden/>
     <w:pPr>
@@ -33675,9 +33850,9 @@
       <w:szCs w:val="20"/>
     </w:rPr>
   </w:style>
-  <w:style w:type="character" w:styleId="186">
+  <w:style w:type="character" w:styleId="875">
     <w:name w:val="endnote reference"/>
-    <w:basedOn w:val="732"/>
+    <w:basedOn w:val="900"/>
     <w:uiPriority w:val="99"/>
     <w:semiHidden/>
     <w:unhideWhenUsed/>
@@ -33690,9 +33865,9 @@
       <w:vertAlign w:val="superscript"/>
     </w:rPr>
   </w:style>
-  <w:style w:type="character" w:styleId="187">
+  <w:style w:type="character" w:styleId="876">
     <w:name w:val="Hyperlink"/>
-    <w:basedOn w:val="732"/>
+    <w:basedOn w:val="900"/>
     <w:uiPriority w:val="99"/>
     <w:unhideWhenUsed/>
     <w:pPr>
@@ -33705,9 +33880,9 @@
       <w:u w:val="single"/>
     </w:rPr>
   </w:style>
-  <w:style w:type="character" w:styleId="188">
+  <w:style w:type="character" w:styleId="877">
     <w:name w:val="FollowedHyperlink"/>
-    <w:basedOn w:val="732"/>
+    <w:basedOn w:val="900"/>
     <w:uiPriority w:val="99"/>
     <w:semiHidden/>
     <w:unhideWhenUsed/>
@@ -33721,10 +33896,10 @@
       <w:u w:val="single"/>
     </w:rPr>
   </w:style>
-  <w:style w:type="paragraph" w:styleId="189">
+  <w:style w:type="paragraph" w:styleId="878">
     <w:name w:val="toc 1"/>
-    <w:basedOn w:val="722"/>
-    <w:next w:val="722"/>
+    <w:basedOn w:val="890"/>
+    <w:next w:val="890"/>
     <w:uiPriority w:val="39"/>
     <w:unhideWhenUsed/>
     <w:pPr>
@@ -33733,10 +33908,10 @@
       <w:ind/>
     </w:pPr>
   </w:style>
-  <w:style w:type="paragraph" w:styleId="190">
+  <w:style w:type="paragraph" w:styleId="879">
     <w:name w:val="toc 2"/>
-    <w:basedOn w:val="722"/>
-    <w:next w:val="722"/>
+    <w:basedOn w:val="890"/>
+    <w:next w:val="890"/>
     <w:uiPriority w:val="39"/>
     <w:unhideWhenUsed/>
     <w:pPr>
@@ -33745,10 +33920,10 @@
       <w:ind w:left="220"/>
     </w:pPr>
   </w:style>
-  <w:style w:type="paragraph" w:styleId="191">
+  <w:style w:type="paragraph" w:styleId="880">
     <w:name w:val="toc 3"/>
-    <w:basedOn w:val="722"/>
-    <w:next w:val="722"/>
+    <w:basedOn w:val="890"/>
+    <w:next w:val="890"/>
     <w:uiPriority w:val="39"/>
     <w:unhideWhenUsed/>
     <w:pPr>
@@ -33757,10 +33932,10 @@
       <w:ind w:left="440"/>
     </w:pPr>
   </w:style>
-  <w:style w:type="paragraph" w:styleId="192">
+  <w:style w:type="paragraph" w:styleId="881">
     <w:name w:val="toc 4"/>
-    <w:basedOn w:val="722"/>
-    <w:next w:val="722"/>
+    <w:basedOn w:val="890"/>
+    <w:next w:val="890"/>
     <w:uiPriority w:val="39"/>
     <w:unhideWhenUsed/>
     <w:pPr>
@@ -33769,10 +33944,10 @@
       <w:ind w:left="660"/>
     </w:pPr>
   </w:style>
-  <w:style w:type="paragraph" w:styleId="193">
+  <w:style w:type="paragraph" w:styleId="882">
     <w:name w:val="toc 5"/>
-    <w:basedOn w:val="722"/>
-    <w:next w:val="722"/>
+    <w:basedOn w:val="890"/>
+    <w:next w:val="890"/>
     <w:uiPriority w:val="39"/>
     <w:unhideWhenUsed/>
     <w:pPr>
@@ -33781,10 +33956,10 @@
       <w:ind w:left="880"/>
     </w:pPr>
   </w:style>
-  <w:style w:type="paragraph" w:styleId="194">
+  <w:style w:type="paragraph" w:styleId="883">
     <w:name w:val="toc 6"/>
-    <w:basedOn w:val="722"/>
-    <w:next w:val="722"/>
+    <w:basedOn w:val="890"/>
+    <w:next w:val="890"/>
     <w:uiPriority w:val="39"/>
     <w:unhideWhenUsed/>
     <w:pPr>
@@ -33793,10 +33968,10 @@
       <w:ind w:left="1100"/>
     </w:pPr>
   </w:style>
-  <w:style w:type="paragraph" w:styleId="195">
+  <w:style w:type="paragraph" w:styleId="884">
     <w:name w:val="toc 7"/>
-    <w:basedOn w:val="722"/>
-    <w:next w:val="722"/>
+    <w:basedOn w:val="890"/>
+    <w:next w:val="890"/>
     <w:uiPriority w:val="39"/>
     <w:unhideWhenUsed/>
     <w:pPr>
@@ -33805,10 +33980,10 @@
       <w:ind w:left="1320"/>
     </w:pPr>
   </w:style>
-  <w:style w:type="paragraph" w:styleId="196">
+  <w:style w:type="paragraph" w:styleId="885">
     <w:name w:val="toc 8"/>
-    <w:basedOn w:val="722"/>
-    <w:next w:val="722"/>
+    <w:basedOn w:val="890"/>
+    <w:next w:val="890"/>
     <w:uiPriority w:val="39"/>
     <w:unhideWhenUsed/>
     <w:pPr>
@@ -33817,10 +33992,10 @@
       <w:ind w:left="1540"/>
     </w:pPr>
   </w:style>
-  <w:style w:type="paragraph" w:styleId="197">
+  <w:style w:type="paragraph" w:styleId="886">
     <w:name w:val="toc 9"/>
-    <w:basedOn w:val="722"/>
-    <w:next w:val="722"/>
+    <w:basedOn w:val="890"/>
+    <w:next w:val="890"/>
     <w:uiPriority w:val="39"/>
     <w:unhideWhenUsed/>
     <w:pPr>
@@ -33829,9 +34004,9 @@
       <w:ind w:left="1760"/>
     </w:pPr>
   </w:style>
-  <w:style w:type="character" w:styleId="198">
+  <w:style w:type="character" w:styleId="887">
     <w:name w:val="Placeholder Text"/>
-    <w:basedOn w:val="732"/>
+    <w:basedOn w:val="900"/>
     <w:uiPriority w:val="99"/>
     <w:semiHidden/>
     <w:pPr>
@@ -33843,7 +34018,7 @@
       <w:color w:val="666666"/>
     </w:rPr>
   </w:style>
-  <w:style w:type="paragraph" w:styleId="208">
+  <w:style w:type="paragraph" w:styleId="888">
     <w:name w:val="TOC Heading"/>
     <w:uiPriority w:val="39"/>
     <w:unhideWhenUsed/>
@@ -33853,10 +34028,10 @@
       <w:ind/>
     </w:pPr>
   </w:style>
-  <w:style w:type="paragraph" w:styleId="209">
+  <w:style w:type="paragraph" w:styleId="889">
     <w:name w:val="table of figures"/>
-    <w:basedOn w:val="722"/>
-    <w:next w:val="722"/>
+    <w:basedOn w:val="890"/>
+    <w:next w:val="890"/>
     <w:uiPriority w:val="99"/>
     <w:unhideWhenUsed/>
     <w:pPr>
@@ -33865,7 +34040,7 @@
       <w:ind/>
     </w:pPr>
   </w:style>
-  <w:style w:type="paragraph" w:styleId="722" w:default="1">
+  <w:style w:type="paragraph" w:styleId="890" w:default="1">
     <w:name w:val="Normal"/>
     <w:qFormat/>
     <w:pPr>
@@ -33874,11 +34049,11 @@
       <w:ind/>
     </w:pPr>
   </w:style>
-  <w:style w:type="paragraph" w:styleId="723">
+  <w:style w:type="paragraph" w:styleId="891">
     <w:name w:val="Heading 1"/>
-    <w:basedOn w:val="722"/>
-    <w:next w:val="722"/>
-    <w:link w:val="735"/>
+    <w:basedOn w:val="890"/>
+    <w:next w:val="890"/>
+    <w:link w:val="903"/>
     <w:uiPriority w:val="9"/>
     <w:qFormat/>
     <w:pPr>
@@ -33896,11 +34071,11 @@
       <w:szCs w:val="40"/>
     </w:rPr>
   </w:style>
-  <w:style w:type="paragraph" w:styleId="724">
+  <w:style w:type="paragraph" w:styleId="892">
     <w:name w:val="Heading 2"/>
-    <w:basedOn w:val="722"/>
-    <w:next w:val="722"/>
-    <w:link w:val="736"/>
+    <w:basedOn w:val="890"/>
+    <w:next w:val="890"/>
+    <w:link w:val="904"/>
     <w:uiPriority w:val="9"/>
     <w:semiHidden/>
     <w:unhideWhenUsed/>
@@ -33920,11 +34095,11 @@
       <w:szCs w:val="32"/>
     </w:rPr>
   </w:style>
-  <w:style w:type="paragraph" w:styleId="725">
+  <w:style w:type="paragraph" w:styleId="893">
     <w:name w:val="Heading 3"/>
-    <w:basedOn w:val="722"/>
-    <w:next w:val="722"/>
-    <w:link w:val="737"/>
+    <w:basedOn w:val="890"/>
+    <w:next w:val="890"/>
+    <w:link w:val="905"/>
     <w:uiPriority w:val="9"/>
     <w:semiHidden/>
     <w:unhideWhenUsed/>
@@ -33944,11 +34119,11 @@
       <w:szCs w:val="28"/>
     </w:rPr>
   </w:style>
-  <w:style w:type="paragraph" w:styleId="726">
+  <w:style w:type="paragraph" w:styleId="894">
     <w:name w:val="Heading 4"/>
-    <w:basedOn w:val="722"/>
-    <w:next w:val="722"/>
-    <w:link w:val="738"/>
+    <w:basedOn w:val="890"/>
+    <w:next w:val="890"/>
+    <w:link w:val="906"/>
     <w:uiPriority w:val="9"/>
     <w:semiHidden/>
     <w:unhideWhenUsed/>
@@ -33968,11 +34143,11 @@
       <w:color w:val="0f4761" w:themeColor="accent1" w:themeShade="BF"/>
     </w:rPr>
   </w:style>
-  <w:style w:type="paragraph" w:styleId="727">
+  <w:style w:type="paragraph" w:styleId="895">
     <w:name w:val="Heading 5"/>
-    <w:basedOn w:val="722"/>
-    <w:next w:val="722"/>
-    <w:link w:val="739"/>
+    <w:basedOn w:val="890"/>
+    <w:next w:val="890"/>
+    <w:link w:val="907"/>
     <w:uiPriority w:val="9"/>
     <w:semiHidden/>
     <w:unhideWhenUsed/>
@@ -33990,11 +34165,11 @@
       <w:color w:val="0f4761" w:themeColor="accent1" w:themeShade="BF"/>
     </w:rPr>
   </w:style>
-  <w:style w:type="paragraph" w:styleId="728">
+  <w:style w:type="paragraph" w:styleId="896">
     <w:name w:val="Heading 6"/>
-    <w:basedOn w:val="722"/>
-    <w:next w:val="722"/>
-    <w:link w:val="740"/>
+    <w:basedOn w:val="890"/>
+    <w:next w:val="890"/>
+    <w:link w:val="908"/>
     <w:uiPriority w:val="9"/>
     <w:semiHidden/>
     <w:unhideWhenUsed/>
@@ -34014,11 +34189,11 @@
       <w:color w:val="595959" w:themeColor="text1" w:themeTint="A6"/>
     </w:rPr>
   </w:style>
-  <w:style w:type="paragraph" w:styleId="729">
+  <w:style w:type="paragraph" w:styleId="897">
     <w:name w:val="Heading 7"/>
-    <w:basedOn w:val="722"/>
-    <w:next w:val="722"/>
-    <w:link w:val="741"/>
+    <w:basedOn w:val="890"/>
+    <w:next w:val="890"/>
+    <w:link w:val="909"/>
     <w:uiPriority w:val="9"/>
     <w:semiHidden/>
     <w:unhideWhenUsed/>
@@ -34036,11 +34211,11 @@
       <w:color w:val="595959" w:themeColor="text1" w:themeTint="A6"/>
     </w:rPr>
   </w:style>
-  <w:style w:type="paragraph" w:styleId="730">
+  <w:style w:type="paragraph" w:styleId="898">
     <w:name w:val="Heading 8"/>
-    <w:basedOn w:val="722"/>
-    <w:next w:val="722"/>
-    <w:link w:val="742"/>
+    <w:basedOn w:val="890"/>
+    <w:next w:val="890"/>
+    <w:link w:val="910"/>
     <w:uiPriority w:val="9"/>
     <w:semiHidden/>
     <w:unhideWhenUsed/>
@@ -34060,11 +34235,11 @@
       <w:color w:val="272727" w:themeColor="text1" w:themeTint="D8"/>
     </w:rPr>
   </w:style>
-  <w:style w:type="paragraph" w:styleId="731">
+  <w:style w:type="paragraph" w:styleId="899">
     <w:name w:val="Heading 9"/>
-    <w:basedOn w:val="722"/>
-    <w:next w:val="722"/>
-    <w:link w:val="743"/>
+    <w:basedOn w:val="890"/>
+    <w:next w:val="890"/>
+    <w:link w:val="911"/>
     <w:uiPriority w:val="9"/>
     <w:semiHidden/>
     <w:unhideWhenUsed/>
@@ -34082,7 +34257,7 @@
       <w:color w:val="272727" w:themeColor="text1" w:themeTint="D8"/>
     </w:rPr>
   </w:style>
-  <w:style w:type="character" w:styleId="732" w:default="1">
+  <w:style w:type="character" w:styleId="900" w:default="1">
     <w:name w:val="Default Paragraph Font"/>
     <w:uiPriority w:val="1"/>
     <w:semiHidden/>
@@ -34093,7 +34268,7 @@
       <w:ind/>
     </w:pPr>
   </w:style>
-  <w:style w:type="table" w:styleId="733" w:default="1">
+  <w:style w:type="table" w:styleId="901" w:default="1">
     <w:name w:val="Normal Table"/>
     <w:uiPriority w:val="99"/>
     <w:semiHidden/>
@@ -34286,7 +34461,7 @@
       </w:tcPr>
     </w:tblStylePr>
   </w:style>
-  <w:style w:type="numbering" w:styleId="734" w:default="1">
+  <w:style w:type="numbering" w:styleId="902" w:default="1">
     <w:name w:val="No List"/>
     <w:uiPriority w:val="99"/>
     <w:semiHidden/>
@@ -34297,10 +34472,10 @@
       <w:ind/>
     </w:pPr>
   </w:style>
-  <w:style w:type="character" w:styleId="735" w:customStyle="1">
+  <w:style w:type="character" w:styleId="903" w:customStyle="1">
     <w:name w:val="Título 1 Char"/>
-    <w:basedOn w:val="732"/>
-    <w:link w:val="723"/>
+    <w:basedOn w:val="900"/>
+    <w:link w:val="891"/>
     <w:uiPriority w:val="9"/>
     <w:pPr>
       <w:pBdr/>
@@ -34314,10 +34489,10 @@
       <w:szCs w:val="40"/>
     </w:rPr>
   </w:style>
-  <w:style w:type="character" w:styleId="736" w:customStyle="1">
+  <w:style w:type="character" w:styleId="904" w:customStyle="1">
     <w:name w:val="Título 2 Char"/>
-    <w:basedOn w:val="732"/>
-    <w:link w:val="724"/>
+    <w:basedOn w:val="900"/>
+    <w:link w:val="892"/>
     <w:uiPriority w:val="9"/>
     <w:semiHidden/>
     <w:pPr>
@@ -34332,10 +34507,10 @@
       <w:szCs w:val="32"/>
     </w:rPr>
   </w:style>
-  <w:style w:type="character" w:styleId="737" w:customStyle="1">
+  <w:style w:type="character" w:styleId="905" w:customStyle="1">
     <w:name w:val="Título 3 Char"/>
-    <w:basedOn w:val="732"/>
-    <w:link w:val="725"/>
+    <w:basedOn w:val="900"/>
+    <w:link w:val="893"/>
     <w:uiPriority w:val="9"/>
     <w:semiHidden/>
     <w:pPr>
@@ -34350,10 +34525,10 @@
       <w:szCs w:val="28"/>
     </w:rPr>
   </w:style>
-  <w:style w:type="character" w:styleId="738" w:customStyle="1">
+  <w:style w:type="character" w:styleId="906" w:customStyle="1">
     <w:name w:val="Título 4 Char"/>
-    <w:basedOn w:val="732"/>
-    <w:link w:val="726"/>
+    <w:basedOn w:val="900"/>
+    <w:link w:val="894"/>
     <w:uiPriority w:val="9"/>
     <w:semiHidden/>
     <w:pPr>
@@ -34368,10 +34543,10 @@
       <w:color w:val="0f4761" w:themeColor="accent1" w:themeShade="BF"/>
     </w:rPr>
   </w:style>
-  <w:style w:type="character" w:styleId="739" w:customStyle="1">
+  <w:style w:type="character" w:styleId="907" w:customStyle="1">
     <w:name w:val="Título 5 Char"/>
-    <w:basedOn w:val="732"/>
-    <w:link w:val="727"/>
+    <w:basedOn w:val="900"/>
+    <w:link w:val="895"/>
     <w:uiPriority w:val="9"/>
     <w:semiHidden/>
     <w:pPr>
@@ -34384,10 +34559,10 @@
       <w:color w:val="0f4761" w:themeColor="accent1" w:themeShade="BF"/>
     </w:rPr>
   </w:style>
-  <w:style w:type="character" w:styleId="740" w:customStyle="1">
+  <w:style w:type="character" w:styleId="908" w:customStyle="1">
     <w:name w:val="Título 6 Char"/>
-    <w:basedOn w:val="732"/>
-    <w:link w:val="728"/>
+    <w:basedOn w:val="900"/>
+    <w:link w:val="896"/>
     <w:uiPriority w:val="9"/>
     <w:semiHidden/>
     <w:pPr>
@@ -34402,10 +34577,10 @@
       <w:color w:val="595959" w:themeColor="text1" w:themeTint="A6"/>
     </w:rPr>
   </w:style>
-  <w:style w:type="character" w:styleId="741" w:customStyle="1">
+  <w:style w:type="character" w:styleId="909" w:customStyle="1">
     <w:name w:val="Título 7 Char"/>
-    <w:basedOn w:val="732"/>
-    <w:link w:val="729"/>
+    <w:basedOn w:val="900"/>
+    <w:link w:val="897"/>
     <w:uiPriority w:val="9"/>
     <w:semiHidden/>
     <w:pPr>
@@ -34418,10 +34593,10 @@
       <w:color w:val="595959" w:themeColor="text1" w:themeTint="A6"/>
     </w:rPr>
   </w:style>
-  <w:style w:type="character" w:styleId="742" w:customStyle="1">
+  <w:style w:type="character" w:styleId="910" w:customStyle="1">
     <w:name w:val="Título 8 Char"/>
-    <w:basedOn w:val="732"/>
-    <w:link w:val="730"/>
+    <w:basedOn w:val="900"/>
+    <w:link w:val="898"/>
     <w:uiPriority w:val="9"/>
     <w:semiHidden/>
     <w:pPr>
@@ -34436,10 +34611,10 @@
       <w:color w:val="272727" w:themeColor="text1" w:themeTint="D8"/>
     </w:rPr>
   </w:style>
-  <w:style w:type="character" w:styleId="743" w:customStyle="1">
+  <w:style w:type="character" w:styleId="911" w:customStyle="1">
     <w:name w:val="Título 9 Char"/>
-    <w:basedOn w:val="732"/>
-    <w:link w:val="731"/>
+    <w:basedOn w:val="900"/>
+    <w:link w:val="899"/>
     <w:uiPriority w:val="9"/>
     <w:semiHidden/>
     <w:pPr>
@@ -34452,11 +34627,11 @@
       <w:color w:val="272727" w:themeColor="text1" w:themeTint="D8"/>
     </w:rPr>
   </w:style>
-  <w:style w:type="paragraph" w:styleId="744">
+  <w:style w:type="paragraph" w:styleId="912">
     <w:name w:val="Title"/>
-    <w:basedOn w:val="722"/>
-    <w:next w:val="722"/>
-    <w:link w:val="745"/>
+    <w:basedOn w:val="890"/>
+    <w:next w:val="890"/>
+    <w:link w:val="913"/>
     <w:uiPriority w:val="10"/>
     <w:qFormat/>
     <w:pPr>
@@ -34472,10 +34647,10 @@
       <w:szCs w:val="56"/>
     </w:rPr>
   </w:style>
-  <w:style w:type="character" w:styleId="745" w:customStyle="1">
+  <w:style w:type="character" w:styleId="913" w:customStyle="1">
     <w:name w:val="Título Char"/>
-    <w:basedOn w:val="732"/>
-    <w:link w:val="744"/>
+    <w:basedOn w:val="900"/>
+    <w:link w:val="912"/>
     <w:uiPriority w:val="10"/>
     <w:pPr>
       <w:pBdr/>
@@ -34489,11 +34664,11 @@
       <w:szCs w:val="56"/>
     </w:rPr>
   </w:style>
-  <w:style w:type="paragraph" w:styleId="746">
+  <w:style w:type="paragraph" w:styleId="914">
     <w:name w:val="Subtitle"/>
-    <w:basedOn w:val="722"/>
-    <w:next w:val="722"/>
-    <w:link w:val="747"/>
+    <w:basedOn w:val="890"/>
+    <w:next w:val="890"/>
+    <w:link w:val="915"/>
     <w:uiPriority w:val="11"/>
     <w:qFormat/>
     <w:pPr>
@@ -34512,10 +34687,10 @@
       <w:szCs w:val="28"/>
     </w:rPr>
   </w:style>
-  <w:style w:type="character" w:styleId="747" w:customStyle="1">
+  <w:style w:type="character" w:styleId="915" w:customStyle="1">
     <w:name w:val="Subtítulo Char"/>
-    <w:basedOn w:val="732"/>
-    <w:link w:val="746"/>
+    <w:basedOn w:val="900"/>
+    <w:link w:val="914"/>
     <w:uiPriority w:val="11"/>
     <w:pPr>
       <w:pBdr/>
@@ -34530,11 +34705,11 @@
       <w:szCs w:val="28"/>
     </w:rPr>
   </w:style>
-  <w:style w:type="paragraph" w:styleId="748">
+  <w:style w:type="paragraph" w:styleId="916">
     <w:name w:val="Quote"/>
-    <w:basedOn w:val="722"/>
-    <w:next w:val="722"/>
-    <w:link w:val="749"/>
+    <w:basedOn w:val="890"/>
+    <w:next w:val="890"/>
+    <w:link w:val="917"/>
     <w:uiPriority w:val="29"/>
     <w:qFormat/>
     <w:pPr>
@@ -34549,10 +34724,10 @@
       <w:color w:val="404040" w:themeColor="text1" w:themeTint="BF"/>
     </w:rPr>
   </w:style>
-  <w:style w:type="character" w:styleId="749" w:customStyle="1">
+  <w:style w:type="character" w:styleId="917" w:customStyle="1">
     <w:name w:val="Citação Char"/>
-    <w:basedOn w:val="732"/>
-    <w:link w:val="748"/>
+    <w:basedOn w:val="900"/>
+    <w:link w:val="916"/>
     <w:uiPriority w:val="29"/>
     <w:pPr>
       <w:pBdr/>
@@ -34565,9 +34740,9 @@
       <w:color w:val="404040" w:themeColor="text1" w:themeTint="BF"/>
     </w:rPr>
   </w:style>
-  <w:style w:type="paragraph" w:styleId="750">
+  <w:style w:type="paragraph" w:styleId="918">
     <w:name w:val="List Paragraph"/>
-    <w:basedOn w:val="722"/>
+    <w:basedOn w:val="890"/>
     <w:uiPriority w:val="34"/>
     <w:qFormat/>
     <w:pPr>
@@ -34577,9 +34752,9 @@
       <w:contextualSpacing w:val="true"/>
     </w:pPr>
   </w:style>
-  <w:style w:type="character" w:styleId="751">
+  <w:style w:type="character" w:styleId="919">
     <w:name w:val="Intense Emphasis"/>
-    <w:basedOn w:val="732"/>
+    <w:basedOn w:val="900"/>
     <w:uiPriority w:val="21"/>
     <w:qFormat/>
     <w:pPr>
@@ -34593,11 +34768,11 @@
       <w:color w:val="0f4761" w:themeColor="accent1" w:themeShade="BF"/>
     </w:rPr>
   </w:style>
-  <w:style w:type="paragraph" w:styleId="752">
+  <w:style w:type="paragraph" w:styleId="920">
     <w:name w:val="Intense Quote"/>
-    <w:basedOn w:val="722"/>
-    <w:next w:val="722"/>
-    <w:link w:val="753"/>
+    <w:basedOn w:val="890"/>
+    <w:next w:val="890"/>
+    <w:link w:val="921"/>
     <w:uiPriority w:val="30"/>
     <w:qFormat/>
     <w:pPr>
@@ -34615,10 +34790,10 @@
       <w:color w:val="0f4761" w:themeColor="accent1" w:themeShade="BF"/>
     </w:rPr>
   </w:style>
-  <w:style w:type="character" w:styleId="753" w:customStyle="1">
+  <w:style w:type="character" w:styleId="921" w:customStyle="1">
     <w:name w:val="Citação Intensa Char"/>
-    <w:basedOn w:val="732"/>
-    <w:link w:val="752"/>
+    <w:basedOn w:val="900"/>
+    <w:link w:val="920"/>
     <w:uiPriority w:val="30"/>
     <w:pPr>
       <w:pBdr/>
@@ -34631,9 +34806,9 @@
       <w:color w:val="0f4761" w:themeColor="accent1" w:themeShade="BF"/>
     </w:rPr>
   </w:style>
-  <w:style w:type="character" w:styleId="754">
+  <w:style w:type="character" w:styleId="922">
     <w:name w:val="Intense Reference"/>
-    <w:basedOn w:val="732"/>
+    <w:basedOn w:val="900"/>
     <w:uiPriority w:val="32"/>
     <w:qFormat/>
     <w:pPr>
@@ -34649,10 +34824,10 @@
       <w:spacing w:val="5"/>
     </w:rPr>
   </w:style>
-  <w:style w:type="paragraph" w:styleId="755">
+  <w:style w:type="paragraph" w:styleId="923">
     <w:name w:val="Header"/>
-    <w:basedOn w:val="722"/>
-    <w:link w:val="756"/>
+    <w:basedOn w:val="890"/>
+    <w:link w:val="924"/>
     <w:uiPriority w:val="99"/>
     <w:unhideWhenUsed/>
     <w:pPr>
@@ -34665,10 +34840,10 @@
       <w:ind/>
     </w:pPr>
   </w:style>
-  <w:style w:type="character" w:styleId="756" w:customStyle="1">
+  <w:style w:type="character" w:styleId="924" w:customStyle="1">
     <w:name w:val="Cabeçalho Char"/>
-    <w:basedOn w:val="732"/>
-    <w:link w:val="755"/>
+    <w:basedOn w:val="900"/>
+    <w:link w:val="923"/>
     <w:uiPriority w:val="99"/>
     <w:pPr>
       <w:pBdr/>
@@ -34676,10 +34851,10 @@
       <w:ind/>
     </w:pPr>
   </w:style>
-  <w:style w:type="paragraph" w:styleId="757">
+  <w:style w:type="paragraph" w:styleId="925">
     <w:name w:val="Footer"/>
-    <w:basedOn w:val="722"/>
-    <w:link w:val="758"/>
+    <w:basedOn w:val="890"/>
+    <w:link w:val="926"/>
     <w:uiPriority w:val="99"/>
     <w:unhideWhenUsed/>
     <w:pPr>
@@ -34692,10 +34867,10 @@
       <w:ind/>
     </w:pPr>
   </w:style>
-  <w:style w:type="character" w:styleId="758" w:customStyle="1">
+  <w:style w:type="character" w:styleId="926" w:customStyle="1">
     <w:name w:val="Rodapé Char"/>
-    <w:basedOn w:val="732"/>
-    <w:link w:val="757"/>
+    <w:basedOn w:val="900"/>
+    <w:link w:val="925"/>
     <w:uiPriority w:val="99"/>
     <w:pPr>
       <w:pBdr/>
@@ -34703,9 +34878,9 @@
       <w:ind/>
     </w:pPr>
   </w:style>
-  <w:style w:type="table" w:styleId="759">
+  <w:style w:type="table" w:styleId="927">
     <w:name w:val="Table Grid"/>
-    <w:basedOn w:val="733"/>
+    <w:basedOn w:val="901"/>
     <w:uiPriority w:val="39"/>
     <w:pPr>
       <w:pBdr/>

</xml_diff>